<commit_message>
Added Dart 3.12+ new features
</commit_message>
<xml_diff>
--- a/d6_dart_new_features.docx
+++ b/d6_dart_new_features.docx
@@ -33,12 +33,190 @@
     </w:p>
     <w:p>
       <w:pPr>
-        <w:jc w:val="both"/>
-        <w:rPr>
-          <w:sz w:val="36"/>
-          <w:szCs w:val="36"/>
-        </w:rPr>
-      </w:pPr>
+        <w:pStyle w:val="ListParagraph"/>
+        <w:numPr>
+          <w:ilvl w:val="0"/>
+          <w:numId w:val="5"/>
+        </w:numPr>
+        <w:jc w:val="both"/>
+        <w:rPr>
+          <w:sz w:val="36"/>
+          <w:szCs w:val="36"/>
+        </w:rPr>
+      </w:pPr>
+      <w:r>
+        <w:rPr>
+          <w:sz w:val="36"/>
+          <w:szCs w:val="36"/>
+        </w:rPr>
+        <w:t xml:space="preserve">Dot Short-hand for </w:t>
+      </w:r>
+      <w:proofErr w:type="spellStart"/>
+      <w:r>
+        <w:rPr>
+          <w:b/>
+          <w:bCs/>
+          <w:sz w:val="36"/>
+          <w:szCs w:val="36"/>
+        </w:rPr>
+        <w:t>enum</w:t>
+      </w:r>
+      <w:proofErr w:type="spellEnd"/>
+      <w:r>
+        <w:rPr>
+          <w:sz w:val="36"/>
+          <w:szCs w:val="36"/>
+        </w:rPr>
+        <w:t>……………………………………</w:t>
+      </w:r>
+      <w:proofErr w:type="gramStart"/>
+      <w:r>
+        <w:rPr>
+          <w:sz w:val="36"/>
+          <w:szCs w:val="36"/>
+        </w:rPr>
+        <w:t>…..</w:t>
+      </w:r>
+      <w:proofErr w:type="gramEnd"/>
+      <w:r>
+        <w:rPr>
+          <w:sz w:val="36"/>
+          <w:szCs w:val="36"/>
+        </w:rPr>
+        <w:t>1</w:t>
+      </w:r>
+    </w:p>
+    <w:p>
+      <w:pPr>
+        <w:pStyle w:val="ListParagraph"/>
+        <w:numPr>
+          <w:ilvl w:val="0"/>
+          <w:numId w:val="5"/>
+        </w:numPr>
+        <w:jc w:val="both"/>
+        <w:rPr>
+          <w:sz w:val="36"/>
+          <w:szCs w:val="36"/>
+        </w:rPr>
+      </w:pPr>
+      <w:r>
+        <w:rPr>
+          <w:sz w:val="36"/>
+          <w:szCs w:val="36"/>
+        </w:rPr>
+        <w:t xml:space="preserve">Dot Short-hand with </w:t>
+      </w:r>
+      <w:r>
+        <w:rPr>
+          <w:b/>
+          <w:bCs/>
+          <w:sz w:val="36"/>
+          <w:szCs w:val="36"/>
+        </w:rPr>
+        <w:t>this</w:t>
+      </w:r>
+      <w:r>
+        <w:rPr>
+          <w:sz w:val="36"/>
+          <w:szCs w:val="36"/>
+        </w:rPr>
+        <w:t>…………………………………………3</w:t>
+      </w:r>
+    </w:p>
+    <w:p>
+      <w:pPr>
+        <w:pStyle w:val="ListParagraph"/>
+        <w:numPr>
+          <w:ilvl w:val="0"/>
+          <w:numId w:val="5"/>
+        </w:numPr>
+        <w:jc w:val="both"/>
+        <w:rPr>
+          <w:sz w:val="36"/>
+          <w:szCs w:val="36"/>
+        </w:rPr>
+      </w:pPr>
+      <w:r>
+        <w:rPr>
+          <w:sz w:val="36"/>
+          <w:szCs w:val="36"/>
+        </w:rPr>
+        <w:t>Dot Short-hand for creating objects………………………….5</w:t>
+      </w:r>
+    </w:p>
+    <w:p>
+      <w:pPr>
+        <w:pStyle w:val="ListParagraph"/>
+        <w:numPr>
+          <w:ilvl w:val="0"/>
+          <w:numId w:val="5"/>
+        </w:numPr>
+        <w:jc w:val="both"/>
+        <w:rPr>
+          <w:sz w:val="36"/>
+          <w:szCs w:val="36"/>
+        </w:rPr>
+      </w:pPr>
+      <w:r>
+        <w:rPr>
+          <w:sz w:val="36"/>
+          <w:szCs w:val="36"/>
+        </w:rPr>
+        <w:t xml:space="preserve">Dart pub cache cleaning (free </w:t>
+      </w:r>
+      <w:proofErr w:type="gramStart"/>
+      <w:r>
+        <w:rPr>
+          <w:sz w:val="36"/>
+          <w:szCs w:val="36"/>
+        </w:rPr>
+        <w:t>storage)…</w:t>
+      </w:r>
+      <w:proofErr w:type="gramEnd"/>
+      <w:r>
+        <w:rPr>
+          <w:sz w:val="36"/>
+          <w:szCs w:val="36"/>
+        </w:rPr>
+        <w:t>……………………6</w:t>
+      </w:r>
+    </w:p>
+    <w:p>
+      <w:pPr>
+        <w:pStyle w:val="ListParagraph"/>
+        <w:numPr>
+          <w:ilvl w:val="0"/>
+          <w:numId w:val="5"/>
+        </w:numPr>
+        <w:jc w:val="both"/>
+        <w:rPr>
+          <w:sz w:val="36"/>
+          <w:szCs w:val="36"/>
+        </w:rPr>
+      </w:pPr>
+      <w:r>
+        <w:rPr>
+          <w:sz w:val="36"/>
+          <w:szCs w:val="36"/>
+        </w:rPr>
+        <w:t>Primary Constructors in Dart………………………………</w:t>
+      </w:r>
+      <w:proofErr w:type="gramStart"/>
+      <w:r>
+        <w:rPr>
+          <w:sz w:val="36"/>
+          <w:szCs w:val="36"/>
+        </w:rPr>
+        <w:t>…..</w:t>
+      </w:r>
+      <w:proofErr w:type="gramEnd"/>
+      <w:r>
+        <w:rPr>
+          <w:sz w:val="36"/>
+          <w:szCs w:val="36"/>
+        </w:rPr>
+        <w:t>9</w:t>
+      </w:r>
     </w:p>
     <w:p>
       <w:pPr>
@@ -5139,9 +5317,2029 @@
     </w:p>
     <w:p>
       <w:pPr>
-        <w:jc w:val="both"/>
-        <w:rPr>
-          <w:rFonts w:cs="Segoe UI Emoji"/>
+        <w:jc w:val="center"/>
+        <w:rPr>
+          <w:rFonts w:cs="Segoe UI Emoji"/>
+          <w:sz w:val="36"/>
+          <w:szCs w:val="36"/>
+        </w:rPr>
+      </w:pPr>
+      <w:r>
+        <w:rPr>
+          <w:rFonts w:cs="Segoe UI Emoji"/>
+          <w:sz w:val="36"/>
+          <w:szCs w:val="36"/>
+        </w:rPr>
+        <w:t>Break</w:t>
+      </w:r>
+    </w:p>
+    <w:p>
+      <w:pPr>
+        <w:jc w:val="both"/>
+        <w:rPr>
+          <w:rFonts w:cs="Segoe UI Emoji"/>
+          <w:b/>
+          <w:bCs/>
+          <w:sz w:val="36"/>
+          <w:szCs w:val="36"/>
+        </w:rPr>
+      </w:pPr>
+    </w:p>
+    <w:p>
+      <w:pPr>
+        <w:jc w:val="both"/>
+        <w:rPr>
+          <w:rFonts w:cs="Segoe UI Emoji"/>
+          <w:b/>
+          <w:bCs/>
+          <w:sz w:val="36"/>
+          <w:szCs w:val="36"/>
+        </w:rPr>
+      </w:pPr>
+      <w:r>
+        <w:rPr>
+          <w:rFonts w:cs="Segoe UI Emoji"/>
+          <w:b/>
+          <w:bCs/>
+          <w:sz w:val="36"/>
+          <w:szCs w:val="36"/>
+        </w:rPr>
+        <w:t>Primary Constructors in Dart (Experimental):</w:t>
+      </w:r>
+    </w:p>
+    <w:p>
+      <w:pPr>
+        <w:jc w:val="both"/>
+        <w:rPr>
+          <w:rFonts w:cs="Segoe UI Emoji"/>
+          <w:sz w:val="36"/>
+          <w:szCs w:val="36"/>
+        </w:rPr>
+      </w:pPr>
+      <w:r>
+        <w:rPr>
+          <w:rFonts w:cs="Segoe UI Emoji"/>
+          <w:sz w:val="36"/>
+          <w:szCs w:val="36"/>
+        </w:rPr>
+        <w:t xml:space="preserve"># It is an </w:t>
+      </w:r>
+      <w:r>
+        <w:rPr>
+          <w:rFonts w:cs="Segoe UI Emoji"/>
+          <w:sz w:val="36"/>
+          <w:szCs w:val="36"/>
+        </w:rPr>
+        <w:t xml:space="preserve">experimental preview </w:t>
+      </w:r>
+      <w:r>
+        <w:rPr>
+          <w:rFonts w:cs="Segoe UI Emoji"/>
+          <w:sz w:val="36"/>
+          <w:szCs w:val="36"/>
+        </w:rPr>
+        <w:t xml:space="preserve">or feature in </w:t>
+      </w:r>
+      <w:r>
+        <w:rPr>
+          <w:rFonts w:cs="Segoe UI Emoji"/>
+          <w:b/>
+          <w:bCs/>
+          <w:sz w:val="36"/>
+          <w:szCs w:val="36"/>
+        </w:rPr>
+        <w:t>Dart 3.12+</w:t>
+      </w:r>
+    </w:p>
+    <w:p>
+      <w:pPr>
+        <w:jc w:val="both"/>
+        <w:rPr>
+          <w:rFonts w:cs="Segoe UI Emoji"/>
+          <w:sz w:val="36"/>
+          <w:szCs w:val="36"/>
+        </w:rPr>
+      </w:pPr>
+      <w:r>
+        <w:rPr>
+          <w:rFonts w:cs="Segoe UI Emoji"/>
+          <w:sz w:val="36"/>
+          <w:szCs w:val="36"/>
+        </w:rPr>
+        <w:t># A</w:t>
+      </w:r>
+      <w:r>
+        <w:rPr>
+          <w:rFonts w:cs="Segoe UI Emoji"/>
+          <w:sz w:val="36"/>
+          <w:szCs w:val="36"/>
+        </w:rPr>
+        <w:t>llows declaring instance variables directly in the</w:t>
+      </w:r>
+      <w:r>
+        <w:rPr>
+          <w:rFonts w:cs="Segoe UI Emoji"/>
+          <w:sz w:val="36"/>
+          <w:szCs w:val="36"/>
+        </w:rPr>
+        <w:t xml:space="preserve"> widget</w:t>
+      </w:r>
+      <w:r>
+        <w:rPr>
+          <w:rFonts w:cs="Segoe UI Emoji"/>
+          <w:sz w:val="36"/>
+          <w:szCs w:val="36"/>
+        </w:rPr>
+        <w:t xml:space="preserve"> class header to drastically reduce boilerplate</w:t>
+      </w:r>
+      <w:r>
+        <w:rPr>
+          <w:rFonts w:cs="Segoe UI Emoji"/>
+          <w:sz w:val="36"/>
+          <w:szCs w:val="36"/>
+        </w:rPr>
+        <w:t>.</w:t>
+      </w:r>
+      <w:r>
+        <w:rPr>
+          <w:rFonts w:cs="Segoe UI Emoji"/>
+          <w:sz w:val="36"/>
+          <w:szCs w:val="36"/>
+        </w:rPr>
+        <w:t xml:space="preserve"> This feature requires enabling the </w:t>
+      </w:r>
+      <w:r>
+        <w:rPr>
+          <w:rFonts w:cs="Segoe UI Emoji"/>
+          <w:b/>
+          <w:bCs/>
+          <w:sz w:val="36"/>
+          <w:szCs w:val="36"/>
+        </w:rPr>
+        <w:t>primary-constructors</w:t>
+      </w:r>
+      <w:r>
+        <w:rPr>
+          <w:rFonts w:cs="Segoe UI Emoji"/>
+          <w:sz w:val="36"/>
+          <w:szCs w:val="36"/>
+        </w:rPr>
+        <w:t xml:space="preserve"> flag.</w:t>
+      </w:r>
+    </w:p>
+    <w:p>
+      <w:pPr>
+        <w:jc w:val="both"/>
+        <w:rPr>
+          <w:rFonts w:cs="Segoe UI Emoji"/>
+          <w:sz w:val="36"/>
+          <w:szCs w:val="36"/>
+        </w:rPr>
+      </w:pPr>
+      <w:r>
+        <w:rPr>
+          <w:rFonts w:cs="Segoe UI Emoji"/>
+          <w:sz w:val="36"/>
+          <w:szCs w:val="36"/>
+        </w:rPr>
+        <w:t># It</w:t>
+      </w:r>
+      <w:r>
+        <w:rPr>
+          <w:rFonts w:cs="Segoe UI Emoji"/>
+          <w:sz w:val="36"/>
+          <w:szCs w:val="36"/>
+        </w:rPr>
+        <w:t xml:space="preserve">’s using newer </w:t>
+      </w:r>
+      <w:r>
+        <w:rPr>
+          <w:rFonts w:cs="Segoe UI Emoji"/>
+          <w:b/>
+          <w:bCs/>
+          <w:sz w:val="36"/>
+          <w:szCs w:val="36"/>
+        </w:rPr>
+        <w:t>Dart</w:t>
+      </w:r>
+      <w:r>
+        <w:rPr>
+          <w:rFonts w:cs="Segoe UI Emoji"/>
+          <w:sz w:val="36"/>
+          <w:szCs w:val="36"/>
+        </w:rPr>
+        <w:t xml:space="preserve"> syntax improvements around:</w:t>
+      </w:r>
+    </w:p>
+    <w:p>
+      <w:pPr>
+        <w:pStyle w:val="ListParagraph"/>
+        <w:numPr>
+          <w:ilvl w:val="0"/>
+          <w:numId w:val="7"/>
+        </w:numPr>
+        <w:jc w:val="both"/>
+        <w:rPr>
+          <w:rFonts w:cs="Segoe UI Emoji"/>
+          <w:sz w:val="36"/>
+          <w:szCs w:val="36"/>
+        </w:rPr>
+      </w:pPr>
+      <w:r>
+        <w:rPr>
+          <w:rFonts w:cs="Segoe UI Emoji"/>
+          <w:sz w:val="36"/>
+          <w:szCs w:val="36"/>
+        </w:rPr>
+        <w:t xml:space="preserve">class modifiers </w:t>
+      </w:r>
+    </w:p>
+    <w:p>
+      <w:pPr>
+        <w:pStyle w:val="ListParagraph"/>
+        <w:numPr>
+          <w:ilvl w:val="0"/>
+          <w:numId w:val="7"/>
+        </w:numPr>
+        <w:jc w:val="both"/>
+        <w:rPr>
+          <w:rFonts w:cs="Segoe UI Emoji"/>
+          <w:sz w:val="36"/>
+          <w:szCs w:val="36"/>
+        </w:rPr>
+      </w:pPr>
+      <w:r>
+        <w:rPr>
+          <w:rFonts w:cs="Segoe UI Emoji"/>
+          <w:sz w:val="36"/>
+          <w:szCs w:val="36"/>
+        </w:rPr>
+        <w:t xml:space="preserve">field formal style </w:t>
+      </w:r>
+    </w:p>
+    <w:p>
+      <w:pPr>
+        <w:pStyle w:val="ListParagraph"/>
+        <w:numPr>
+          <w:ilvl w:val="0"/>
+          <w:numId w:val="7"/>
+        </w:numPr>
+        <w:jc w:val="both"/>
+        <w:rPr>
+          <w:rFonts w:cs="Segoe UI Emoji"/>
+          <w:sz w:val="36"/>
+          <w:szCs w:val="36"/>
+        </w:rPr>
+      </w:pPr>
+      <w:r>
+        <w:rPr>
+          <w:rFonts w:cs="Segoe UI Emoji"/>
+          <w:sz w:val="36"/>
+          <w:szCs w:val="36"/>
+        </w:rPr>
+        <w:t>constructor shorthand evolution</w:t>
+      </w:r>
+    </w:p>
+    <w:p>
+      <w:pPr>
+        <w:jc w:val="both"/>
+        <w:rPr>
+          <w:rFonts w:cs="Segoe UI Emoji"/>
+          <w:sz w:val="36"/>
+          <w:szCs w:val="36"/>
+        </w:rPr>
+      </w:pPr>
+      <w:r>
+        <w:rPr>
+          <w:rFonts w:cs="Segoe UI Emoji"/>
+          <w:sz w:val="36"/>
+          <w:szCs w:val="36"/>
+        </w:rPr>
+        <w:t># Old style:</w:t>
+      </w:r>
+    </w:p>
+    <w:p>
+      <w:pPr>
+        <w:jc w:val="both"/>
+        <w:rPr>
+          <w:rFonts w:cs="Segoe UI Emoji"/>
+          <w:b/>
+          <w:bCs/>
+          <w:color w:val="D86DCB" w:themeColor="accent5" w:themeTint="99"/>
+          <w:sz w:val="36"/>
+          <w:szCs w:val="36"/>
+        </w:rPr>
+      </w:pPr>
+      <w:r>
+        <w:rPr>
+          <w:rFonts w:cs="Segoe UI Emoji"/>
+          <w:b/>
+          <w:bCs/>
+          <w:color w:val="D86DCB" w:themeColor="accent5" w:themeTint="99"/>
+          <w:sz w:val="36"/>
+          <w:szCs w:val="36"/>
+        </w:rPr>
+        <w:t xml:space="preserve">class </w:t>
+      </w:r>
+      <w:proofErr w:type="spellStart"/>
+      <w:r>
+        <w:rPr>
+          <w:rFonts w:cs="Segoe UI Emoji"/>
+          <w:b/>
+          <w:bCs/>
+          <w:color w:val="D86DCB" w:themeColor="accent5" w:themeTint="99"/>
+          <w:sz w:val="36"/>
+          <w:szCs w:val="36"/>
+        </w:rPr>
+        <w:t>UserCard</w:t>
+      </w:r>
+      <w:proofErr w:type="spellEnd"/>
+      <w:r>
+        <w:rPr>
+          <w:rFonts w:cs="Segoe UI Emoji"/>
+          <w:b/>
+          <w:bCs/>
+          <w:color w:val="D86DCB" w:themeColor="accent5" w:themeTint="99"/>
+          <w:sz w:val="36"/>
+          <w:szCs w:val="36"/>
+        </w:rPr>
+        <w:t xml:space="preserve"> extends </w:t>
+      </w:r>
+      <w:proofErr w:type="spellStart"/>
+      <w:r>
+        <w:rPr>
+          <w:rFonts w:cs="Segoe UI Emoji"/>
+          <w:b/>
+          <w:bCs/>
+          <w:color w:val="D86DCB" w:themeColor="accent5" w:themeTint="99"/>
+          <w:sz w:val="36"/>
+          <w:szCs w:val="36"/>
+        </w:rPr>
+        <w:t>StatelessWidget</w:t>
+      </w:r>
+      <w:proofErr w:type="spellEnd"/>
+      <w:r>
+        <w:rPr>
+          <w:rFonts w:cs="Segoe UI Emoji"/>
+          <w:b/>
+          <w:bCs/>
+          <w:color w:val="D86DCB" w:themeColor="accent5" w:themeTint="99"/>
+          <w:sz w:val="36"/>
+          <w:szCs w:val="36"/>
+        </w:rPr>
+        <w:t xml:space="preserve"> {</w:t>
+      </w:r>
+    </w:p>
+    <w:p>
+      <w:pPr>
+        <w:jc w:val="both"/>
+        <w:rPr>
+          <w:rFonts w:cs="Segoe UI Emoji"/>
+          <w:b/>
+          <w:bCs/>
+          <w:color w:val="D86DCB" w:themeColor="accent5" w:themeTint="99"/>
+          <w:sz w:val="36"/>
+          <w:szCs w:val="36"/>
+        </w:rPr>
+      </w:pPr>
+      <w:r>
+        <w:rPr>
+          <w:rFonts w:cs="Segoe UI Emoji"/>
+          <w:b/>
+          <w:bCs/>
+          <w:color w:val="D86DCB" w:themeColor="accent5" w:themeTint="99"/>
+          <w:sz w:val="36"/>
+          <w:szCs w:val="36"/>
+        </w:rPr>
+        <w:t xml:space="preserve">  final String name;</w:t>
+      </w:r>
+    </w:p>
+    <w:p>
+      <w:pPr>
+        <w:jc w:val="both"/>
+        <w:rPr>
+          <w:rFonts w:cs="Segoe UI Emoji"/>
+          <w:b/>
+          <w:bCs/>
+          <w:color w:val="D86DCB" w:themeColor="accent5" w:themeTint="99"/>
+          <w:sz w:val="36"/>
+          <w:szCs w:val="36"/>
+        </w:rPr>
+      </w:pPr>
+      <w:r>
+        <w:rPr>
+          <w:rFonts w:cs="Segoe UI Emoji"/>
+          <w:b/>
+          <w:bCs/>
+          <w:color w:val="D86DCB" w:themeColor="accent5" w:themeTint="99"/>
+          <w:sz w:val="36"/>
+          <w:szCs w:val="36"/>
+        </w:rPr>
+        <w:t xml:space="preserve">  final String email;</w:t>
+      </w:r>
+    </w:p>
+    <w:p>
+      <w:pPr>
+        <w:jc w:val="both"/>
+        <w:rPr>
+          <w:rFonts w:cs="Segoe UI Emoji"/>
+          <w:b/>
+          <w:bCs/>
+          <w:color w:val="D86DCB" w:themeColor="accent5" w:themeTint="99"/>
+          <w:sz w:val="36"/>
+          <w:szCs w:val="36"/>
+        </w:rPr>
+      </w:pPr>
+      <w:r>
+        <w:rPr>
+          <w:rFonts w:cs="Segoe UI Emoji"/>
+          <w:b/>
+          <w:bCs/>
+          <w:color w:val="D86DCB" w:themeColor="accent5" w:themeTint="99"/>
+          <w:sz w:val="36"/>
+          <w:szCs w:val="36"/>
+        </w:rPr>
+        <w:t xml:space="preserve">  const </w:t>
+      </w:r>
+      <w:proofErr w:type="spellStart"/>
+      <w:proofErr w:type="gramStart"/>
+      <w:r>
+        <w:rPr>
+          <w:rFonts w:cs="Segoe UI Emoji"/>
+          <w:b/>
+          <w:bCs/>
+          <w:color w:val="D86DCB" w:themeColor="accent5" w:themeTint="99"/>
+          <w:sz w:val="36"/>
+          <w:szCs w:val="36"/>
+        </w:rPr>
+        <w:t>UserCard</w:t>
+      </w:r>
+      <w:proofErr w:type="spellEnd"/>
+      <w:r>
+        <w:rPr>
+          <w:rFonts w:cs="Segoe UI Emoji"/>
+          <w:b/>
+          <w:bCs/>
+          <w:color w:val="D86DCB" w:themeColor="accent5" w:themeTint="99"/>
+          <w:sz w:val="36"/>
+          <w:szCs w:val="36"/>
+        </w:rPr>
+        <w:t>(</w:t>
+      </w:r>
+      <w:proofErr w:type="gramEnd"/>
+      <w:r>
+        <w:rPr>
+          <w:rFonts w:cs="Segoe UI Emoji"/>
+          <w:b/>
+          <w:bCs/>
+          <w:color w:val="D86DCB" w:themeColor="accent5" w:themeTint="99"/>
+          <w:sz w:val="36"/>
+          <w:szCs w:val="36"/>
+        </w:rPr>
+        <w:t>{</w:t>
+      </w:r>
+    </w:p>
+    <w:p>
+      <w:pPr>
+        <w:jc w:val="both"/>
+        <w:rPr>
+          <w:rFonts w:cs="Segoe UI Emoji"/>
+          <w:b/>
+          <w:bCs/>
+          <w:color w:val="D86DCB" w:themeColor="accent5" w:themeTint="99"/>
+          <w:sz w:val="36"/>
+          <w:szCs w:val="36"/>
+        </w:rPr>
+      </w:pPr>
+      <w:r>
+        <w:rPr>
+          <w:rFonts w:cs="Segoe UI Emoji"/>
+          <w:b/>
+          <w:bCs/>
+          <w:color w:val="D86DCB" w:themeColor="accent5" w:themeTint="99"/>
+          <w:sz w:val="36"/>
+          <w:szCs w:val="36"/>
+        </w:rPr>
+        <w:t xml:space="preserve">    </w:t>
+      </w:r>
+      <w:proofErr w:type="spellStart"/>
+      <w:r>
+        <w:rPr>
+          <w:rFonts w:cs="Segoe UI Emoji"/>
+          <w:b/>
+          <w:bCs/>
+          <w:color w:val="D86DCB" w:themeColor="accent5" w:themeTint="99"/>
+          <w:sz w:val="36"/>
+          <w:szCs w:val="36"/>
+        </w:rPr>
+        <w:t>super.key</w:t>
+      </w:r>
+      <w:proofErr w:type="spellEnd"/>
+      <w:r>
+        <w:rPr>
+          <w:rFonts w:cs="Segoe UI Emoji"/>
+          <w:b/>
+          <w:bCs/>
+          <w:color w:val="D86DCB" w:themeColor="accent5" w:themeTint="99"/>
+          <w:sz w:val="36"/>
+          <w:szCs w:val="36"/>
+        </w:rPr>
+        <w:t>,</w:t>
+      </w:r>
+    </w:p>
+    <w:p>
+      <w:pPr>
+        <w:jc w:val="both"/>
+        <w:rPr>
+          <w:rFonts w:cs="Segoe UI Emoji"/>
+          <w:b/>
+          <w:bCs/>
+          <w:color w:val="D86DCB" w:themeColor="accent5" w:themeTint="99"/>
+          <w:sz w:val="36"/>
+          <w:szCs w:val="36"/>
+        </w:rPr>
+      </w:pPr>
+      <w:r>
+        <w:rPr>
+          <w:rFonts w:cs="Segoe UI Emoji"/>
+          <w:b/>
+          <w:bCs/>
+          <w:color w:val="D86DCB" w:themeColor="accent5" w:themeTint="99"/>
+          <w:sz w:val="36"/>
+          <w:szCs w:val="36"/>
+        </w:rPr>
+        <w:t xml:space="preserve">    required this.name,</w:t>
+      </w:r>
+    </w:p>
+    <w:p>
+      <w:pPr>
+        <w:jc w:val="both"/>
+        <w:rPr>
+          <w:rFonts w:cs="Segoe UI Emoji"/>
+          <w:b/>
+          <w:bCs/>
+          <w:color w:val="D86DCB" w:themeColor="accent5" w:themeTint="99"/>
+          <w:sz w:val="36"/>
+          <w:szCs w:val="36"/>
+        </w:rPr>
+      </w:pPr>
+      <w:r>
+        <w:rPr>
+          <w:rFonts w:cs="Segoe UI Emoji"/>
+          <w:b/>
+          <w:bCs/>
+          <w:color w:val="D86DCB" w:themeColor="accent5" w:themeTint="99"/>
+          <w:sz w:val="36"/>
+          <w:szCs w:val="36"/>
+        </w:rPr>
+        <w:t xml:space="preserve">    required </w:t>
+      </w:r>
+      <w:proofErr w:type="spellStart"/>
+      <w:proofErr w:type="gramStart"/>
+      <w:r>
+        <w:rPr>
+          <w:rFonts w:cs="Segoe UI Emoji"/>
+          <w:b/>
+          <w:bCs/>
+          <w:color w:val="D86DCB" w:themeColor="accent5" w:themeTint="99"/>
+          <w:sz w:val="36"/>
+          <w:szCs w:val="36"/>
+        </w:rPr>
+        <w:t>this.email</w:t>
+      </w:r>
+      <w:proofErr w:type="spellEnd"/>
+      <w:proofErr w:type="gramEnd"/>
+      <w:r>
+        <w:rPr>
+          <w:rFonts w:cs="Segoe UI Emoji"/>
+          <w:b/>
+          <w:bCs/>
+          <w:color w:val="D86DCB" w:themeColor="accent5" w:themeTint="99"/>
+          <w:sz w:val="36"/>
+          <w:szCs w:val="36"/>
+        </w:rPr>
+        <w:t>,</w:t>
+      </w:r>
+    </w:p>
+    <w:p>
+      <w:pPr>
+        <w:jc w:val="both"/>
+        <w:rPr>
+          <w:rFonts w:cs="Segoe UI Emoji"/>
+          <w:b/>
+          <w:bCs/>
+          <w:color w:val="D86DCB" w:themeColor="accent5" w:themeTint="99"/>
+          <w:sz w:val="36"/>
+          <w:szCs w:val="36"/>
+        </w:rPr>
+      </w:pPr>
+      <w:r>
+        <w:rPr>
+          <w:rFonts w:cs="Segoe UI Emoji"/>
+          <w:b/>
+          <w:bCs/>
+          <w:color w:val="D86DCB" w:themeColor="accent5" w:themeTint="99"/>
+          <w:sz w:val="36"/>
+          <w:szCs w:val="36"/>
+        </w:rPr>
+        <w:t xml:space="preserve">  });</w:t>
+      </w:r>
+    </w:p>
+    <w:p>
+      <w:pPr>
+        <w:jc w:val="both"/>
+        <w:rPr>
+          <w:rFonts w:cs="Segoe UI Emoji"/>
+          <w:b/>
+          <w:bCs/>
+          <w:color w:val="D86DCB" w:themeColor="accent5" w:themeTint="99"/>
+          <w:sz w:val="36"/>
+          <w:szCs w:val="36"/>
+        </w:rPr>
+      </w:pPr>
+    </w:p>
+    <w:p>
+      <w:pPr>
+        <w:jc w:val="both"/>
+        <w:rPr>
+          <w:rFonts w:cs="Segoe UI Emoji"/>
+          <w:b/>
+          <w:bCs/>
+          <w:color w:val="D86DCB" w:themeColor="accent5" w:themeTint="99"/>
+          <w:sz w:val="36"/>
+          <w:szCs w:val="36"/>
+        </w:rPr>
+      </w:pPr>
+      <w:r>
+        <w:rPr>
+          <w:rFonts w:cs="Segoe UI Emoji"/>
+          <w:b/>
+          <w:bCs/>
+          <w:color w:val="D86DCB" w:themeColor="accent5" w:themeTint="99"/>
+          <w:sz w:val="36"/>
+          <w:szCs w:val="36"/>
+        </w:rPr>
+        <w:lastRenderedPageBreak/>
+        <w:t xml:space="preserve">  @override</w:t>
+      </w:r>
+    </w:p>
+    <w:p>
+      <w:pPr>
+        <w:jc w:val="both"/>
+        <w:rPr>
+          <w:rFonts w:cs="Segoe UI Emoji"/>
+          <w:b/>
+          <w:bCs/>
+          <w:color w:val="D86DCB" w:themeColor="accent5" w:themeTint="99"/>
+          <w:sz w:val="36"/>
+          <w:szCs w:val="36"/>
+        </w:rPr>
+      </w:pPr>
+      <w:r>
+        <w:rPr>
+          <w:rFonts w:cs="Segoe UI Emoji"/>
+          <w:b/>
+          <w:bCs/>
+          <w:color w:val="D86DCB" w:themeColor="accent5" w:themeTint="99"/>
+          <w:sz w:val="36"/>
+          <w:szCs w:val="36"/>
+        </w:rPr>
+        <w:t xml:space="preserve">  Widget </w:t>
+      </w:r>
+      <w:proofErr w:type="gramStart"/>
+      <w:r>
+        <w:rPr>
+          <w:rFonts w:cs="Segoe UI Emoji"/>
+          <w:b/>
+          <w:bCs/>
+          <w:color w:val="D86DCB" w:themeColor="accent5" w:themeTint="99"/>
+          <w:sz w:val="36"/>
+          <w:szCs w:val="36"/>
+        </w:rPr>
+        <w:t>build(</w:t>
+      </w:r>
+      <w:proofErr w:type="spellStart"/>
+      <w:proofErr w:type="gramEnd"/>
+      <w:r>
+        <w:rPr>
+          <w:rFonts w:cs="Segoe UI Emoji"/>
+          <w:b/>
+          <w:bCs/>
+          <w:color w:val="D86DCB" w:themeColor="accent5" w:themeTint="99"/>
+          <w:sz w:val="36"/>
+          <w:szCs w:val="36"/>
+        </w:rPr>
+        <w:t>BuildContext</w:t>
+      </w:r>
+      <w:proofErr w:type="spellEnd"/>
+      <w:r>
+        <w:rPr>
+          <w:rFonts w:cs="Segoe UI Emoji"/>
+          <w:b/>
+          <w:bCs/>
+          <w:color w:val="D86DCB" w:themeColor="accent5" w:themeTint="99"/>
+          <w:sz w:val="36"/>
+          <w:szCs w:val="36"/>
+        </w:rPr>
+        <w:t xml:space="preserve"> context) {</w:t>
+      </w:r>
+    </w:p>
+    <w:p>
+      <w:pPr>
+        <w:jc w:val="both"/>
+        <w:rPr>
+          <w:rFonts w:cs="Segoe UI Emoji"/>
+          <w:b/>
+          <w:bCs/>
+          <w:color w:val="D86DCB" w:themeColor="accent5" w:themeTint="99"/>
+          <w:sz w:val="36"/>
+          <w:szCs w:val="36"/>
+        </w:rPr>
+      </w:pPr>
+      <w:r>
+        <w:rPr>
+          <w:rFonts w:cs="Segoe UI Emoji"/>
+          <w:b/>
+          <w:bCs/>
+          <w:color w:val="D86DCB" w:themeColor="accent5" w:themeTint="99"/>
+          <w:sz w:val="36"/>
+          <w:szCs w:val="36"/>
+        </w:rPr>
+        <w:t xml:space="preserve">    return Text(name);</w:t>
+      </w:r>
+    </w:p>
+    <w:p>
+      <w:pPr>
+        <w:jc w:val="both"/>
+        <w:rPr>
+          <w:rFonts w:cs="Segoe UI Emoji"/>
+          <w:b/>
+          <w:bCs/>
+          <w:color w:val="D86DCB" w:themeColor="accent5" w:themeTint="99"/>
+          <w:sz w:val="36"/>
+          <w:szCs w:val="36"/>
+        </w:rPr>
+      </w:pPr>
+      <w:r>
+        <w:rPr>
+          <w:rFonts w:cs="Segoe UI Emoji"/>
+          <w:b/>
+          <w:bCs/>
+          <w:color w:val="D86DCB" w:themeColor="accent5" w:themeTint="99"/>
+          <w:sz w:val="36"/>
+          <w:szCs w:val="36"/>
+        </w:rPr>
+        <w:t xml:space="preserve">  }</w:t>
+      </w:r>
+    </w:p>
+    <w:p>
+      <w:pPr>
+        <w:jc w:val="both"/>
+        <w:rPr>
+          <w:rFonts w:cs="Segoe UI Emoji"/>
+          <w:b/>
+          <w:bCs/>
+          <w:color w:val="D86DCB" w:themeColor="accent5" w:themeTint="99"/>
+          <w:sz w:val="36"/>
+          <w:szCs w:val="36"/>
+        </w:rPr>
+      </w:pPr>
+      <w:r>
+        <w:rPr>
+          <w:rFonts w:cs="Segoe UI Emoji"/>
+          <w:b/>
+          <w:bCs/>
+          <w:color w:val="D86DCB" w:themeColor="accent5" w:themeTint="99"/>
+          <w:sz w:val="36"/>
+          <w:szCs w:val="36"/>
+        </w:rPr>
+        <w:t>}</w:t>
+      </w:r>
+    </w:p>
+    <w:p>
+      <w:pPr>
+        <w:jc w:val="both"/>
+        <w:rPr>
+          <w:rFonts w:cs="Segoe UI Emoji"/>
+          <w:sz w:val="36"/>
+          <w:szCs w:val="36"/>
+        </w:rPr>
+      </w:pPr>
+      <w:r>
+        <w:rPr>
+          <w:rFonts w:cs="Segoe UI Emoji"/>
+          <w:sz w:val="36"/>
+          <w:szCs w:val="36"/>
+        </w:rPr>
+        <w:t># Newer concise style:</w:t>
+      </w:r>
+    </w:p>
+    <w:p>
+      <w:pPr>
+        <w:jc w:val="both"/>
+        <w:rPr>
+          <w:rFonts w:cs="Segoe UI Emoji"/>
+          <w:b/>
+          <w:bCs/>
+          <w:color w:val="D86DCB" w:themeColor="accent5" w:themeTint="99"/>
+          <w:sz w:val="36"/>
+          <w:szCs w:val="36"/>
+        </w:rPr>
+      </w:pPr>
+      <w:r>
+        <w:rPr>
+          <w:rFonts w:cs="Segoe UI Emoji"/>
+          <w:b/>
+          <w:bCs/>
+          <w:color w:val="D86DCB" w:themeColor="accent5" w:themeTint="99"/>
+          <w:sz w:val="36"/>
+          <w:szCs w:val="36"/>
+        </w:rPr>
+        <w:t xml:space="preserve">class </w:t>
+      </w:r>
+      <w:proofErr w:type="spellStart"/>
+      <w:proofErr w:type="gramStart"/>
+      <w:r>
+        <w:rPr>
+          <w:rFonts w:cs="Segoe UI Emoji"/>
+          <w:b/>
+          <w:bCs/>
+          <w:color w:val="D86DCB" w:themeColor="accent5" w:themeTint="99"/>
+          <w:sz w:val="36"/>
+          <w:szCs w:val="36"/>
+        </w:rPr>
+        <w:t>UserCard</w:t>
+      </w:r>
+      <w:proofErr w:type="spellEnd"/>
+      <w:r>
+        <w:rPr>
+          <w:rFonts w:cs="Segoe UI Emoji"/>
+          <w:b/>
+          <w:bCs/>
+          <w:color w:val="D86DCB" w:themeColor="accent5" w:themeTint="99"/>
+          <w:sz w:val="36"/>
+          <w:szCs w:val="36"/>
+        </w:rPr>
+        <w:t>(</w:t>
+      </w:r>
+      <w:proofErr w:type="gramEnd"/>
+      <w:r>
+        <w:rPr>
+          <w:rFonts w:cs="Segoe UI Emoji"/>
+          <w:b/>
+          <w:bCs/>
+          <w:color w:val="D86DCB" w:themeColor="accent5" w:themeTint="99"/>
+          <w:sz w:val="36"/>
+          <w:szCs w:val="36"/>
+        </w:rPr>
+        <w:t>{</w:t>
+      </w:r>
+    </w:p>
+    <w:p>
+      <w:pPr>
+        <w:jc w:val="both"/>
+        <w:rPr>
+          <w:rFonts w:cs="Segoe UI Emoji"/>
+          <w:b/>
+          <w:bCs/>
+          <w:color w:val="D86DCB" w:themeColor="accent5" w:themeTint="99"/>
+          <w:sz w:val="36"/>
+          <w:szCs w:val="36"/>
+        </w:rPr>
+      </w:pPr>
+      <w:r>
+        <w:rPr>
+          <w:rFonts w:cs="Segoe UI Emoji"/>
+          <w:b/>
+          <w:bCs/>
+          <w:color w:val="D86DCB" w:themeColor="accent5" w:themeTint="99"/>
+          <w:sz w:val="36"/>
+          <w:szCs w:val="36"/>
+        </w:rPr>
+        <w:t xml:space="preserve">  </w:t>
+      </w:r>
+      <w:proofErr w:type="spellStart"/>
+      <w:r>
+        <w:rPr>
+          <w:rFonts w:cs="Segoe UI Emoji"/>
+          <w:b/>
+          <w:bCs/>
+          <w:color w:val="D86DCB" w:themeColor="accent5" w:themeTint="99"/>
+          <w:sz w:val="36"/>
+          <w:szCs w:val="36"/>
+        </w:rPr>
+        <w:t>super.key</w:t>
+      </w:r>
+      <w:proofErr w:type="spellEnd"/>
+      <w:r>
+        <w:rPr>
+          <w:rFonts w:cs="Segoe UI Emoji"/>
+          <w:b/>
+          <w:bCs/>
+          <w:color w:val="D86DCB" w:themeColor="accent5" w:themeTint="99"/>
+          <w:sz w:val="36"/>
+          <w:szCs w:val="36"/>
+        </w:rPr>
+        <w:t>,</w:t>
+      </w:r>
+    </w:p>
+    <w:p>
+      <w:pPr>
+        <w:jc w:val="both"/>
+        <w:rPr>
+          <w:rFonts w:cs="Segoe UI Emoji"/>
+          <w:b/>
+          <w:bCs/>
+          <w:color w:val="D86DCB" w:themeColor="accent5" w:themeTint="99"/>
+          <w:sz w:val="36"/>
+          <w:szCs w:val="36"/>
+        </w:rPr>
+      </w:pPr>
+      <w:r>
+        <w:rPr>
+          <w:rFonts w:cs="Segoe UI Emoji"/>
+          <w:b/>
+          <w:bCs/>
+          <w:color w:val="D86DCB" w:themeColor="accent5" w:themeTint="99"/>
+          <w:sz w:val="36"/>
+          <w:szCs w:val="36"/>
+        </w:rPr>
+        <w:t xml:space="preserve">  required this.name,</w:t>
+      </w:r>
+    </w:p>
+    <w:p>
+      <w:pPr>
+        <w:jc w:val="both"/>
+        <w:rPr>
+          <w:rFonts w:cs="Segoe UI Emoji"/>
+          <w:b/>
+          <w:bCs/>
+          <w:color w:val="D86DCB" w:themeColor="accent5" w:themeTint="99"/>
+          <w:sz w:val="36"/>
+          <w:szCs w:val="36"/>
+        </w:rPr>
+      </w:pPr>
+      <w:r>
+        <w:rPr>
+          <w:rFonts w:cs="Segoe UI Emoji"/>
+          <w:b/>
+          <w:bCs/>
+          <w:color w:val="D86DCB" w:themeColor="accent5" w:themeTint="99"/>
+          <w:sz w:val="36"/>
+          <w:szCs w:val="36"/>
+        </w:rPr>
+        <w:t xml:space="preserve">  required </w:t>
+      </w:r>
+      <w:proofErr w:type="spellStart"/>
+      <w:proofErr w:type="gramStart"/>
+      <w:r>
+        <w:rPr>
+          <w:rFonts w:cs="Segoe UI Emoji"/>
+          <w:b/>
+          <w:bCs/>
+          <w:color w:val="D86DCB" w:themeColor="accent5" w:themeTint="99"/>
+          <w:sz w:val="36"/>
+          <w:szCs w:val="36"/>
+        </w:rPr>
+        <w:t>this.email</w:t>
+      </w:r>
+      <w:proofErr w:type="spellEnd"/>
+      <w:proofErr w:type="gramEnd"/>
+      <w:r>
+        <w:rPr>
+          <w:rFonts w:cs="Segoe UI Emoji"/>
+          <w:b/>
+          <w:bCs/>
+          <w:color w:val="D86DCB" w:themeColor="accent5" w:themeTint="99"/>
+          <w:sz w:val="36"/>
+          <w:szCs w:val="36"/>
+        </w:rPr>
+        <w:t>,</w:t>
+      </w:r>
+    </w:p>
+    <w:p>
+      <w:pPr>
+        <w:jc w:val="both"/>
+        <w:rPr>
+          <w:rFonts w:cs="Segoe UI Emoji"/>
+          <w:b/>
+          <w:bCs/>
+          <w:color w:val="D86DCB" w:themeColor="accent5" w:themeTint="99"/>
+          <w:sz w:val="36"/>
+          <w:szCs w:val="36"/>
+        </w:rPr>
+      </w:pPr>
+      <w:r>
+        <w:rPr>
+          <w:rFonts w:cs="Segoe UI Emoji"/>
+          <w:b/>
+          <w:bCs/>
+          <w:color w:val="D86DCB" w:themeColor="accent5" w:themeTint="99"/>
+          <w:sz w:val="36"/>
+          <w:szCs w:val="36"/>
+        </w:rPr>
+        <w:t xml:space="preserve">}) extends </w:t>
+      </w:r>
+      <w:proofErr w:type="spellStart"/>
+      <w:r>
+        <w:rPr>
+          <w:rFonts w:cs="Segoe UI Emoji"/>
+          <w:b/>
+          <w:bCs/>
+          <w:color w:val="D86DCB" w:themeColor="accent5" w:themeTint="99"/>
+          <w:sz w:val="36"/>
+          <w:szCs w:val="36"/>
+        </w:rPr>
+        <w:t>StatelessWidget</w:t>
+      </w:r>
+      <w:proofErr w:type="spellEnd"/>
+      <w:r>
+        <w:rPr>
+          <w:rFonts w:cs="Segoe UI Emoji"/>
+          <w:b/>
+          <w:bCs/>
+          <w:color w:val="D86DCB" w:themeColor="accent5" w:themeTint="99"/>
+          <w:sz w:val="36"/>
+          <w:szCs w:val="36"/>
+        </w:rPr>
+        <w:t xml:space="preserve"> {</w:t>
+      </w:r>
+    </w:p>
+    <w:p>
+      <w:pPr>
+        <w:jc w:val="both"/>
+        <w:rPr>
+          <w:rFonts w:cs="Segoe UI Emoji"/>
+          <w:b/>
+          <w:bCs/>
+          <w:color w:val="D86DCB" w:themeColor="accent5" w:themeTint="99"/>
+          <w:sz w:val="36"/>
+          <w:szCs w:val="36"/>
+        </w:rPr>
+      </w:pPr>
+      <w:r>
+        <w:rPr>
+          <w:rFonts w:cs="Segoe UI Emoji"/>
+          <w:b/>
+          <w:bCs/>
+          <w:color w:val="D86DCB" w:themeColor="accent5" w:themeTint="99"/>
+          <w:sz w:val="36"/>
+          <w:szCs w:val="36"/>
+        </w:rPr>
+        <w:t xml:space="preserve">  final String name;</w:t>
+      </w:r>
+    </w:p>
+    <w:p>
+      <w:pPr>
+        <w:jc w:val="both"/>
+        <w:rPr>
+          <w:rFonts w:cs="Segoe UI Emoji"/>
+          <w:b/>
+          <w:bCs/>
+          <w:color w:val="D86DCB" w:themeColor="accent5" w:themeTint="99"/>
+          <w:sz w:val="36"/>
+          <w:szCs w:val="36"/>
+        </w:rPr>
+      </w:pPr>
+      <w:r>
+        <w:rPr>
+          <w:rFonts w:cs="Segoe UI Emoji"/>
+          <w:b/>
+          <w:bCs/>
+          <w:color w:val="D86DCB" w:themeColor="accent5" w:themeTint="99"/>
+          <w:sz w:val="36"/>
+          <w:szCs w:val="36"/>
+        </w:rPr>
+        <w:t xml:space="preserve">  final String email;</w:t>
+      </w:r>
+    </w:p>
+    <w:p>
+      <w:pPr>
+        <w:jc w:val="both"/>
+        <w:rPr>
+          <w:rFonts w:cs="Segoe UI Emoji"/>
+          <w:b/>
+          <w:bCs/>
+          <w:color w:val="D86DCB" w:themeColor="accent5" w:themeTint="99"/>
+          <w:sz w:val="36"/>
+          <w:szCs w:val="36"/>
+        </w:rPr>
+      </w:pPr>
+      <w:r>
+        <w:rPr>
+          <w:rFonts w:cs="Segoe UI Emoji"/>
+          <w:b/>
+          <w:bCs/>
+          <w:color w:val="D86DCB" w:themeColor="accent5" w:themeTint="99"/>
+          <w:sz w:val="36"/>
+          <w:szCs w:val="36"/>
+        </w:rPr>
+        <w:t xml:space="preserve">  @override</w:t>
+      </w:r>
+    </w:p>
+    <w:p>
+      <w:pPr>
+        <w:jc w:val="both"/>
+        <w:rPr>
+          <w:rFonts w:cs="Segoe UI Emoji"/>
+          <w:b/>
+          <w:bCs/>
+          <w:color w:val="D86DCB" w:themeColor="accent5" w:themeTint="99"/>
+          <w:sz w:val="36"/>
+          <w:szCs w:val="36"/>
+        </w:rPr>
+      </w:pPr>
+      <w:r>
+        <w:rPr>
+          <w:rFonts w:cs="Segoe UI Emoji"/>
+          <w:b/>
+          <w:bCs/>
+          <w:color w:val="D86DCB" w:themeColor="accent5" w:themeTint="99"/>
+          <w:sz w:val="36"/>
+          <w:szCs w:val="36"/>
+        </w:rPr>
+        <w:t xml:space="preserve">  Widget </w:t>
+      </w:r>
+      <w:proofErr w:type="gramStart"/>
+      <w:r>
+        <w:rPr>
+          <w:rFonts w:cs="Segoe UI Emoji"/>
+          <w:b/>
+          <w:bCs/>
+          <w:color w:val="D86DCB" w:themeColor="accent5" w:themeTint="99"/>
+          <w:sz w:val="36"/>
+          <w:szCs w:val="36"/>
+        </w:rPr>
+        <w:t>build(</w:t>
+      </w:r>
+      <w:proofErr w:type="spellStart"/>
+      <w:proofErr w:type="gramEnd"/>
+      <w:r>
+        <w:rPr>
+          <w:rFonts w:cs="Segoe UI Emoji"/>
+          <w:b/>
+          <w:bCs/>
+          <w:color w:val="D86DCB" w:themeColor="accent5" w:themeTint="99"/>
+          <w:sz w:val="36"/>
+          <w:szCs w:val="36"/>
+        </w:rPr>
+        <w:t>BuildContext</w:t>
+      </w:r>
+      <w:proofErr w:type="spellEnd"/>
+      <w:r>
+        <w:rPr>
+          <w:rFonts w:cs="Segoe UI Emoji"/>
+          <w:b/>
+          <w:bCs/>
+          <w:color w:val="D86DCB" w:themeColor="accent5" w:themeTint="99"/>
+          <w:sz w:val="36"/>
+          <w:szCs w:val="36"/>
+        </w:rPr>
+        <w:t xml:space="preserve"> context) {</w:t>
+      </w:r>
+    </w:p>
+    <w:p>
+      <w:pPr>
+        <w:jc w:val="both"/>
+        <w:rPr>
+          <w:rFonts w:cs="Segoe UI Emoji"/>
+          <w:b/>
+          <w:bCs/>
+          <w:color w:val="D86DCB" w:themeColor="accent5" w:themeTint="99"/>
+          <w:sz w:val="36"/>
+          <w:szCs w:val="36"/>
+        </w:rPr>
+      </w:pPr>
+      <w:r>
+        <w:rPr>
+          <w:rFonts w:cs="Segoe UI Emoji"/>
+          <w:b/>
+          <w:bCs/>
+          <w:color w:val="D86DCB" w:themeColor="accent5" w:themeTint="99"/>
+          <w:sz w:val="36"/>
+          <w:szCs w:val="36"/>
+        </w:rPr>
+        <w:t xml:space="preserve">    return Text(name);</w:t>
+      </w:r>
+    </w:p>
+    <w:p>
+      <w:pPr>
+        <w:jc w:val="both"/>
+        <w:rPr>
+          <w:rFonts w:cs="Segoe UI Emoji"/>
+          <w:b/>
+          <w:bCs/>
+          <w:color w:val="D86DCB" w:themeColor="accent5" w:themeTint="99"/>
+          <w:sz w:val="36"/>
+          <w:szCs w:val="36"/>
+        </w:rPr>
+      </w:pPr>
+      <w:r>
+        <w:rPr>
+          <w:rFonts w:cs="Segoe UI Emoji"/>
+          <w:b/>
+          <w:bCs/>
+          <w:color w:val="D86DCB" w:themeColor="accent5" w:themeTint="99"/>
+          <w:sz w:val="36"/>
+          <w:szCs w:val="36"/>
+        </w:rPr>
+        <w:t xml:space="preserve">  }</w:t>
+      </w:r>
+    </w:p>
+    <w:p>
+      <w:pPr>
+        <w:jc w:val="both"/>
+        <w:rPr>
+          <w:rFonts w:cs="Segoe UI Emoji"/>
+          <w:b/>
+          <w:bCs/>
+          <w:color w:val="D86DCB" w:themeColor="accent5" w:themeTint="99"/>
+          <w:sz w:val="36"/>
+          <w:szCs w:val="36"/>
+        </w:rPr>
+      </w:pPr>
+      <w:r>
+        <w:rPr>
+          <w:rFonts w:cs="Segoe UI Emoji"/>
+          <w:b/>
+          <w:bCs/>
+          <w:color w:val="D86DCB" w:themeColor="accent5" w:themeTint="99"/>
+          <w:sz w:val="36"/>
+          <w:szCs w:val="36"/>
+        </w:rPr>
+        <w:t>}</w:t>
+      </w:r>
+    </w:p>
+    <w:p>
+      <w:pPr>
+        <w:jc w:val="both"/>
+        <w:rPr>
+          <w:rFonts w:cs="Segoe UI Emoji"/>
+          <w:sz w:val="36"/>
+          <w:szCs w:val="36"/>
+        </w:rPr>
+      </w:pPr>
+    </w:p>
+    <w:p>
+      <w:pPr>
+        <w:jc w:val="both"/>
+        <w:rPr>
+          <w:sz w:val="36"/>
+          <w:szCs w:val="36"/>
+        </w:rPr>
+      </w:pPr>
+      <w:r>
+        <w:rPr>
+          <w:sz w:val="36"/>
+          <w:szCs w:val="36"/>
+        </w:rPr>
+        <w:t>Pros and Cons:</w:t>
+      </w:r>
+    </w:p>
+    <w:p>
+      <w:pPr>
+        <w:jc w:val="both"/>
+        <w:rPr>
+          <w:sz w:val="36"/>
+          <w:szCs w:val="36"/>
+        </w:rPr>
+      </w:pPr>
+      <w:r>
+        <w:rPr>
+          <w:sz w:val="36"/>
+          <w:szCs w:val="36"/>
+        </w:rPr>
+        <w:t># Advantages:</w:t>
+      </w:r>
+    </w:p>
+    <w:p>
+      <w:pPr>
+        <w:pStyle w:val="ListParagraph"/>
+        <w:numPr>
+          <w:ilvl w:val="0"/>
+          <w:numId w:val="8"/>
+        </w:numPr>
+        <w:jc w:val="both"/>
+        <w:rPr>
+          <w:sz w:val="36"/>
+          <w:szCs w:val="36"/>
+        </w:rPr>
+      </w:pPr>
+      <w:r>
+        <w:rPr>
+          <w:sz w:val="36"/>
+          <w:szCs w:val="36"/>
+        </w:rPr>
+        <w:lastRenderedPageBreak/>
+        <w:t>Less boilerplate</w:t>
+      </w:r>
+      <w:r>
+        <w:rPr>
+          <w:sz w:val="36"/>
+          <w:szCs w:val="36"/>
+        </w:rPr>
+        <w:t xml:space="preserve"> e</w:t>
+      </w:r>
+      <w:r>
+        <w:rPr>
+          <w:sz w:val="36"/>
+          <w:szCs w:val="36"/>
+        </w:rPr>
+        <w:t xml:space="preserve">specially for </w:t>
+      </w:r>
+      <w:r>
+        <w:rPr>
+          <w:b/>
+          <w:bCs/>
+          <w:sz w:val="36"/>
+          <w:szCs w:val="36"/>
+        </w:rPr>
+        <w:t>Flutter</w:t>
+      </w:r>
+      <w:r>
+        <w:rPr>
+          <w:sz w:val="36"/>
+          <w:szCs w:val="36"/>
+        </w:rPr>
+        <w:t xml:space="preserve"> widgets.</w:t>
+      </w:r>
+    </w:p>
+    <w:p>
+      <w:pPr>
+        <w:pStyle w:val="ListParagraph"/>
+        <w:numPr>
+          <w:ilvl w:val="0"/>
+          <w:numId w:val="8"/>
+        </w:numPr>
+        <w:jc w:val="both"/>
+        <w:rPr>
+          <w:sz w:val="36"/>
+          <w:szCs w:val="36"/>
+        </w:rPr>
+      </w:pPr>
+      <w:r>
+        <w:rPr>
+          <w:sz w:val="36"/>
+          <w:szCs w:val="36"/>
+        </w:rPr>
+        <w:t>Better readability (sometimes)</w:t>
+      </w:r>
+      <w:r>
+        <w:rPr>
+          <w:sz w:val="36"/>
+          <w:szCs w:val="36"/>
+        </w:rPr>
+        <w:t xml:space="preserve"> because p</w:t>
+      </w:r>
+      <w:r>
+        <w:rPr>
+          <w:sz w:val="36"/>
+          <w:szCs w:val="36"/>
+        </w:rPr>
+        <w:t xml:space="preserve">arameters </w:t>
+      </w:r>
+      <w:r>
+        <w:rPr>
+          <w:sz w:val="36"/>
+          <w:szCs w:val="36"/>
+        </w:rPr>
+        <w:t xml:space="preserve">are </w:t>
+      </w:r>
+      <w:r>
+        <w:rPr>
+          <w:sz w:val="36"/>
+          <w:szCs w:val="36"/>
+        </w:rPr>
+        <w:t>visible immediately.</w:t>
+      </w:r>
+    </w:p>
+    <w:p>
+      <w:pPr>
+        <w:pStyle w:val="ListParagraph"/>
+        <w:numPr>
+          <w:ilvl w:val="0"/>
+          <w:numId w:val="8"/>
+        </w:numPr>
+        <w:jc w:val="both"/>
+        <w:rPr>
+          <w:sz w:val="36"/>
+          <w:szCs w:val="36"/>
+        </w:rPr>
+      </w:pPr>
+      <w:r>
+        <w:rPr>
+          <w:sz w:val="36"/>
+          <w:szCs w:val="36"/>
+        </w:rPr>
+        <w:t>More declarative feel</w:t>
+      </w:r>
+      <w:r>
+        <w:rPr>
+          <w:sz w:val="36"/>
+          <w:szCs w:val="36"/>
+        </w:rPr>
+        <w:t>,</w:t>
+      </w:r>
+      <w:r>
+        <w:rPr>
+          <w:sz w:val="36"/>
+          <w:szCs w:val="36"/>
+        </w:rPr>
+        <w:t xml:space="preserve"> c</w:t>
+      </w:r>
+      <w:r>
+        <w:rPr>
+          <w:sz w:val="36"/>
+          <w:szCs w:val="36"/>
+        </w:rPr>
+        <w:t xml:space="preserve">loser to </w:t>
+      </w:r>
+      <w:r>
+        <w:rPr>
+          <w:b/>
+          <w:bCs/>
+          <w:sz w:val="36"/>
+          <w:szCs w:val="36"/>
+        </w:rPr>
+        <w:t>Swift</w:t>
+      </w:r>
+      <w:r>
+        <w:rPr>
+          <w:sz w:val="36"/>
+          <w:szCs w:val="36"/>
+        </w:rPr>
+        <w:t>/</w:t>
+      </w:r>
+      <w:r>
+        <w:rPr>
+          <w:b/>
+          <w:bCs/>
+          <w:sz w:val="36"/>
+          <w:szCs w:val="36"/>
+        </w:rPr>
+        <w:t>Kotlin</w:t>
+      </w:r>
+      <w:r>
+        <w:rPr>
+          <w:sz w:val="36"/>
+          <w:szCs w:val="36"/>
+        </w:rPr>
+        <w:t xml:space="preserve"> modern syntax.</w:t>
+      </w:r>
+    </w:p>
+    <w:p>
+      <w:pPr>
+        <w:jc w:val="both"/>
+        <w:rPr>
+          <w:sz w:val="36"/>
+          <w:szCs w:val="36"/>
+        </w:rPr>
+      </w:pPr>
+      <w:r>
+        <w:rPr>
+          <w:sz w:val="36"/>
+          <w:szCs w:val="36"/>
+        </w:rPr>
+        <w:t># Disadvantages:</w:t>
+      </w:r>
+    </w:p>
+    <w:p>
+      <w:pPr>
+        <w:pStyle w:val="ListParagraph"/>
+        <w:numPr>
+          <w:ilvl w:val="0"/>
+          <w:numId w:val="9"/>
+        </w:numPr>
+        <w:jc w:val="both"/>
+        <w:rPr>
+          <w:sz w:val="36"/>
+          <w:szCs w:val="36"/>
+        </w:rPr>
+      </w:pPr>
+      <w:r>
+        <w:rPr>
+          <w:sz w:val="36"/>
+          <w:szCs w:val="36"/>
+        </w:rPr>
+        <w:t xml:space="preserve">Many </w:t>
+      </w:r>
+      <w:proofErr w:type="gramStart"/>
+      <w:r>
+        <w:rPr>
+          <w:b/>
+          <w:bCs/>
+          <w:sz w:val="36"/>
+          <w:szCs w:val="36"/>
+        </w:rPr>
+        <w:t>Flutter</w:t>
+      </w:r>
+      <w:proofErr w:type="gramEnd"/>
+      <w:r>
+        <w:rPr>
+          <w:sz w:val="36"/>
+          <w:szCs w:val="36"/>
+        </w:rPr>
+        <w:t xml:space="preserve"> dev</w:t>
+      </w:r>
+      <w:r>
+        <w:rPr>
+          <w:sz w:val="36"/>
+          <w:szCs w:val="36"/>
+        </w:rPr>
+        <w:t>’</w:t>
+      </w:r>
+      <w:r>
+        <w:rPr>
+          <w:sz w:val="36"/>
+          <w:szCs w:val="36"/>
+        </w:rPr>
+        <w:t>s don’t know it yet</w:t>
+      </w:r>
+      <w:r>
+        <w:rPr>
+          <w:sz w:val="36"/>
+          <w:szCs w:val="36"/>
+        </w:rPr>
+        <w:t xml:space="preserve">. </w:t>
+      </w:r>
+      <w:r>
+        <w:rPr>
+          <w:sz w:val="36"/>
+          <w:szCs w:val="36"/>
+        </w:rPr>
+        <w:t>Team readability matters more than “cool syntax”.</w:t>
+      </w:r>
+    </w:p>
+    <w:p>
+      <w:pPr>
+        <w:pStyle w:val="ListParagraph"/>
+        <w:numPr>
+          <w:ilvl w:val="0"/>
+          <w:numId w:val="9"/>
+        </w:numPr>
+        <w:jc w:val="both"/>
+        <w:rPr>
+          <w:sz w:val="36"/>
+          <w:szCs w:val="36"/>
+        </w:rPr>
+      </w:pPr>
+      <w:r>
+        <w:rPr>
+          <w:sz w:val="36"/>
+          <w:szCs w:val="36"/>
+        </w:rPr>
+        <w:t>Tooling</w:t>
+      </w:r>
+      <w:r>
+        <w:rPr>
+          <w:sz w:val="36"/>
+          <w:szCs w:val="36"/>
+        </w:rPr>
+        <w:t xml:space="preserve"> </w:t>
+      </w:r>
+      <w:r>
+        <w:rPr>
+          <w:sz w:val="36"/>
+          <w:szCs w:val="36"/>
+        </w:rPr>
+        <w:t>/</w:t>
+      </w:r>
+      <w:r>
+        <w:rPr>
+          <w:sz w:val="36"/>
+          <w:szCs w:val="36"/>
+        </w:rPr>
+        <w:t xml:space="preserve"> </w:t>
+      </w:r>
+      <w:r>
+        <w:rPr>
+          <w:sz w:val="36"/>
+          <w:szCs w:val="36"/>
+        </w:rPr>
+        <w:t>ecosystem</w:t>
+      </w:r>
+      <w:r>
+        <w:rPr>
+          <w:sz w:val="36"/>
+          <w:szCs w:val="36"/>
+        </w:rPr>
+        <w:t xml:space="preserve"> </w:t>
+      </w:r>
+      <w:r>
+        <w:rPr>
+          <w:sz w:val="36"/>
+          <w:szCs w:val="36"/>
+        </w:rPr>
+        <w:t>/</w:t>
+      </w:r>
+      <w:r>
+        <w:rPr>
+          <w:sz w:val="36"/>
+          <w:szCs w:val="36"/>
+        </w:rPr>
+        <w:t xml:space="preserve"> </w:t>
+      </w:r>
+      <w:r>
+        <w:rPr>
+          <w:sz w:val="36"/>
+          <w:szCs w:val="36"/>
+        </w:rPr>
+        <w:t>codebases are</w:t>
+      </w:r>
+      <w:r>
+        <w:rPr>
+          <w:sz w:val="36"/>
+          <w:szCs w:val="36"/>
+        </w:rPr>
+        <w:t xml:space="preserve"> still adapting</w:t>
+      </w:r>
+    </w:p>
+    <w:p>
+      <w:pPr>
+        <w:pStyle w:val="ListParagraph"/>
+        <w:numPr>
+          <w:ilvl w:val="0"/>
+          <w:numId w:val="9"/>
+        </w:numPr>
+        <w:jc w:val="both"/>
+        <w:rPr>
+          <w:sz w:val="36"/>
+          <w:szCs w:val="36"/>
+        </w:rPr>
+      </w:pPr>
+      <w:r>
+        <w:rPr>
+          <w:sz w:val="36"/>
+          <w:szCs w:val="36"/>
+        </w:rPr>
+        <w:t>Can become visually dense</w:t>
+      </w:r>
+      <w:r>
+        <w:rPr>
+          <w:sz w:val="36"/>
+          <w:szCs w:val="36"/>
+        </w:rPr>
+        <w:t xml:space="preserve"> or ugly f</w:t>
+      </w:r>
+      <w:r>
+        <w:rPr>
+          <w:sz w:val="36"/>
+          <w:szCs w:val="36"/>
+        </w:rPr>
+        <w:t>or large widgets:</w:t>
+      </w:r>
+    </w:p>
+    <w:p>
+      <w:pPr>
+        <w:jc w:val="both"/>
+        <w:rPr>
+          <w:b/>
+          <w:bCs/>
+          <w:color w:val="D86DCB" w:themeColor="accent5" w:themeTint="99"/>
+          <w:sz w:val="36"/>
+          <w:szCs w:val="36"/>
+        </w:rPr>
+      </w:pPr>
+      <w:r>
+        <w:rPr>
+          <w:b/>
+          <w:bCs/>
+          <w:color w:val="D86DCB" w:themeColor="accent5" w:themeTint="99"/>
+          <w:sz w:val="36"/>
+          <w:szCs w:val="36"/>
+        </w:rPr>
+        <w:t xml:space="preserve">class </w:t>
+      </w:r>
+      <w:proofErr w:type="spellStart"/>
+      <w:proofErr w:type="gramStart"/>
+      <w:r>
+        <w:rPr>
+          <w:b/>
+          <w:bCs/>
+          <w:color w:val="D86DCB" w:themeColor="accent5" w:themeTint="99"/>
+          <w:sz w:val="36"/>
+          <w:szCs w:val="36"/>
+        </w:rPr>
+        <w:t>MegaCard</w:t>
+      </w:r>
+      <w:proofErr w:type="spellEnd"/>
+      <w:r>
+        <w:rPr>
+          <w:b/>
+          <w:bCs/>
+          <w:color w:val="D86DCB" w:themeColor="accent5" w:themeTint="99"/>
+          <w:sz w:val="36"/>
+          <w:szCs w:val="36"/>
+        </w:rPr>
+        <w:t>(</w:t>
+      </w:r>
+      <w:proofErr w:type="gramEnd"/>
+      <w:r>
+        <w:rPr>
+          <w:b/>
+          <w:bCs/>
+          <w:color w:val="D86DCB" w:themeColor="accent5" w:themeTint="99"/>
+          <w:sz w:val="36"/>
+          <w:szCs w:val="36"/>
+        </w:rPr>
+        <w:t>{</w:t>
+      </w:r>
+    </w:p>
+    <w:p>
+      <w:pPr>
+        <w:jc w:val="both"/>
+        <w:rPr>
+          <w:b/>
+          <w:bCs/>
+          <w:color w:val="D86DCB" w:themeColor="accent5" w:themeTint="99"/>
+          <w:sz w:val="36"/>
+          <w:szCs w:val="36"/>
+        </w:rPr>
+      </w:pPr>
+      <w:r>
+        <w:rPr>
+          <w:b/>
+          <w:bCs/>
+          <w:color w:val="D86DCB" w:themeColor="accent5" w:themeTint="99"/>
+          <w:sz w:val="36"/>
+          <w:szCs w:val="36"/>
+        </w:rPr>
+        <w:t xml:space="preserve">  required </w:t>
+      </w:r>
+      <w:proofErr w:type="spellStart"/>
+      <w:proofErr w:type="gramStart"/>
+      <w:r>
+        <w:rPr>
+          <w:b/>
+          <w:bCs/>
+          <w:color w:val="D86DCB" w:themeColor="accent5" w:themeTint="99"/>
+          <w:sz w:val="36"/>
+          <w:szCs w:val="36"/>
+        </w:rPr>
+        <w:t>this.a</w:t>
+      </w:r>
+      <w:proofErr w:type="spellEnd"/>
+      <w:proofErr w:type="gramEnd"/>
+      <w:r>
+        <w:rPr>
+          <w:b/>
+          <w:bCs/>
+          <w:color w:val="D86DCB" w:themeColor="accent5" w:themeTint="99"/>
+          <w:sz w:val="36"/>
+          <w:szCs w:val="36"/>
+        </w:rPr>
+        <w:t>,</w:t>
+      </w:r>
+    </w:p>
+    <w:p>
+      <w:pPr>
+        <w:jc w:val="both"/>
+        <w:rPr>
+          <w:b/>
+          <w:bCs/>
+          <w:color w:val="D86DCB" w:themeColor="accent5" w:themeTint="99"/>
+          <w:sz w:val="36"/>
+          <w:szCs w:val="36"/>
+        </w:rPr>
+      </w:pPr>
+      <w:r>
+        <w:rPr>
+          <w:b/>
+          <w:bCs/>
+          <w:color w:val="D86DCB" w:themeColor="accent5" w:themeTint="99"/>
+          <w:sz w:val="36"/>
+          <w:szCs w:val="36"/>
+        </w:rPr>
+        <w:t xml:space="preserve">  required </w:t>
+      </w:r>
+      <w:proofErr w:type="spellStart"/>
+      <w:proofErr w:type="gramStart"/>
+      <w:r>
+        <w:rPr>
+          <w:b/>
+          <w:bCs/>
+          <w:color w:val="D86DCB" w:themeColor="accent5" w:themeTint="99"/>
+          <w:sz w:val="36"/>
+          <w:szCs w:val="36"/>
+        </w:rPr>
+        <w:t>this.b</w:t>
+      </w:r>
+      <w:proofErr w:type="spellEnd"/>
+      <w:proofErr w:type="gramEnd"/>
+      <w:r>
+        <w:rPr>
+          <w:b/>
+          <w:bCs/>
+          <w:color w:val="D86DCB" w:themeColor="accent5" w:themeTint="99"/>
+          <w:sz w:val="36"/>
+          <w:szCs w:val="36"/>
+        </w:rPr>
+        <w:t>,</w:t>
+      </w:r>
+    </w:p>
+    <w:p>
+      <w:pPr>
+        <w:jc w:val="both"/>
+        <w:rPr>
+          <w:b/>
+          <w:bCs/>
+          <w:color w:val="D86DCB" w:themeColor="accent5" w:themeTint="99"/>
+          <w:sz w:val="36"/>
+          <w:szCs w:val="36"/>
+        </w:rPr>
+      </w:pPr>
+      <w:r>
+        <w:rPr>
+          <w:b/>
+          <w:bCs/>
+          <w:color w:val="D86DCB" w:themeColor="accent5" w:themeTint="99"/>
+          <w:sz w:val="36"/>
+          <w:szCs w:val="36"/>
+        </w:rPr>
+        <w:t xml:space="preserve">  required </w:t>
+      </w:r>
+      <w:proofErr w:type="spellStart"/>
+      <w:r>
+        <w:rPr>
+          <w:b/>
+          <w:bCs/>
+          <w:color w:val="D86DCB" w:themeColor="accent5" w:themeTint="99"/>
+          <w:sz w:val="36"/>
+          <w:szCs w:val="36"/>
+        </w:rPr>
+        <w:t>this.c</w:t>
+      </w:r>
+      <w:proofErr w:type="spellEnd"/>
+      <w:r>
+        <w:rPr>
+          <w:b/>
+          <w:bCs/>
+          <w:color w:val="D86DCB" w:themeColor="accent5" w:themeTint="99"/>
+          <w:sz w:val="36"/>
+          <w:szCs w:val="36"/>
+        </w:rPr>
+        <w:t>,</w:t>
+      </w:r>
+    </w:p>
+    <w:p>
+      <w:pPr>
+        <w:jc w:val="both"/>
+        <w:rPr>
+          <w:b/>
+          <w:bCs/>
+          <w:color w:val="D86DCB" w:themeColor="accent5" w:themeTint="99"/>
+          <w:sz w:val="36"/>
+          <w:szCs w:val="36"/>
+        </w:rPr>
+      </w:pPr>
+      <w:r>
+        <w:rPr>
+          <w:b/>
+          <w:bCs/>
+          <w:color w:val="D86DCB" w:themeColor="accent5" w:themeTint="99"/>
+          <w:sz w:val="36"/>
+          <w:szCs w:val="36"/>
+        </w:rPr>
+        <w:t xml:space="preserve">  required </w:t>
+      </w:r>
+      <w:proofErr w:type="spellStart"/>
+      <w:proofErr w:type="gramStart"/>
+      <w:r>
+        <w:rPr>
+          <w:b/>
+          <w:bCs/>
+          <w:color w:val="D86DCB" w:themeColor="accent5" w:themeTint="99"/>
+          <w:sz w:val="36"/>
+          <w:szCs w:val="36"/>
+        </w:rPr>
+        <w:t>this.d</w:t>
+      </w:r>
+      <w:proofErr w:type="spellEnd"/>
+      <w:proofErr w:type="gramEnd"/>
+      <w:r>
+        <w:rPr>
+          <w:b/>
+          <w:bCs/>
+          <w:color w:val="D86DCB" w:themeColor="accent5" w:themeTint="99"/>
+          <w:sz w:val="36"/>
+          <w:szCs w:val="36"/>
+        </w:rPr>
+        <w:t>,</w:t>
+      </w:r>
+    </w:p>
+    <w:p>
+      <w:pPr>
+        <w:jc w:val="both"/>
+        <w:rPr>
+          <w:b/>
+          <w:bCs/>
+          <w:color w:val="D86DCB" w:themeColor="accent5" w:themeTint="99"/>
+          <w:sz w:val="36"/>
+          <w:szCs w:val="36"/>
+        </w:rPr>
+      </w:pPr>
+      <w:r>
+        <w:rPr>
+          <w:b/>
+          <w:bCs/>
+          <w:color w:val="D86DCB" w:themeColor="accent5" w:themeTint="99"/>
+          <w:sz w:val="36"/>
+          <w:szCs w:val="36"/>
+        </w:rPr>
+        <w:t xml:space="preserve">  required </w:t>
+      </w:r>
+      <w:proofErr w:type="spellStart"/>
+      <w:proofErr w:type="gramStart"/>
+      <w:r>
+        <w:rPr>
+          <w:b/>
+          <w:bCs/>
+          <w:color w:val="D86DCB" w:themeColor="accent5" w:themeTint="99"/>
+          <w:sz w:val="36"/>
+          <w:szCs w:val="36"/>
+        </w:rPr>
+        <w:t>this.e</w:t>
+      </w:r>
+      <w:proofErr w:type="spellEnd"/>
+      <w:proofErr w:type="gramEnd"/>
+      <w:r>
+        <w:rPr>
+          <w:b/>
+          <w:bCs/>
+          <w:color w:val="D86DCB" w:themeColor="accent5" w:themeTint="99"/>
+          <w:sz w:val="36"/>
+          <w:szCs w:val="36"/>
+        </w:rPr>
+        <w:t>,</w:t>
+      </w:r>
+    </w:p>
+    <w:p>
+      <w:pPr>
+        <w:jc w:val="both"/>
+        <w:rPr>
+          <w:b/>
+          <w:bCs/>
+          <w:color w:val="D86DCB" w:themeColor="accent5" w:themeTint="99"/>
+          <w:sz w:val="36"/>
+          <w:szCs w:val="36"/>
+        </w:rPr>
+      </w:pPr>
+      <w:r>
+        <w:rPr>
+          <w:b/>
+          <w:bCs/>
+          <w:color w:val="D86DCB" w:themeColor="accent5" w:themeTint="99"/>
+          <w:sz w:val="36"/>
+          <w:szCs w:val="36"/>
+        </w:rPr>
+        <w:t>})</w:t>
+      </w:r>
+    </w:p>
+    <w:p>
+      <w:pPr>
+        <w:jc w:val="both"/>
+        <w:rPr>
+          <w:sz w:val="36"/>
+          <w:szCs w:val="36"/>
+        </w:rPr>
+      </w:pPr>
+    </w:p>
+    <w:p>
+      <w:pPr>
+        <w:jc w:val="center"/>
+        <w:rPr>
+          <w:sz w:val="36"/>
+          <w:szCs w:val="36"/>
+        </w:rPr>
+      </w:pPr>
+      <w:r>
+        <w:rPr>
+          <w:sz w:val="36"/>
+          <w:szCs w:val="36"/>
+        </w:rPr>
+        <w:t>Break</w:t>
+      </w:r>
+    </w:p>
+    <w:p>
+      <w:pPr>
+        <w:rPr>
+          <w:sz w:val="36"/>
+          <w:szCs w:val="36"/>
+        </w:rPr>
+      </w:pPr>
+    </w:p>
+    <w:p>
+      <w:pPr>
+        <w:rPr>
+          <w:sz w:val="36"/>
+          <w:szCs w:val="36"/>
+        </w:rPr>
+      </w:pPr>
+    </w:p>
+    <w:p>
+      <w:pPr>
+        <w:jc w:val="both"/>
+        <w:rPr>
           <w:sz w:val="36"/>
           <w:szCs w:val="36"/>
         </w:rPr>
@@ -5157,6 +7355,7 @@
       </w:pPr>
     </w:p>
     <w:sectPr>
+      <w:footerReference w:type="default" r:id="rId7"/>
       <w:pgSz w:w="11906" w:h="16838" w:code="9"/>
       <w:pgMar w:top="1440" w:right="1440" w:bottom="1440" w:left="1440" w:header="720" w:footer="720" w:gutter="0"/>
       <w:cols w:space="720"/>
@@ -5166,12 +7365,115 @@
 </w:document>
 </file>
 
+<file path=word/endnotes.xml><?xml version="1.0" encoding="utf-8"?>
+<w:endnotes xmlns:wpc="http://schemas.microsoft.com/office/word/2010/wordprocessingCanvas" xmlns:cx="http://schemas.microsoft.com/office/drawing/2014/chartex" xmlns:cx1="http://schemas.microsoft.com/office/drawing/2015/9/8/chartex" xmlns:cx2="http://schemas.microsoft.com/office/drawing/2015/10/21/chartex" xmlns:cx3="http://schemas.microsoft.com/office/drawing/2016/5/9/chartex" xmlns:cx4="http://schemas.microsoft.com/office/drawing/2016/5/10/chartex" xmlns:cx5="http://schemas.microsoft.com/office/drawing/2016/5/11/chartex" xmlns:cx6="http://schemas.microsoft.com/office/drawing/2016/5/12/chartex" xmlns:cx7="http://schemas.microsoft.com/office/drawing/2016/5/13/chartex" xmlns:cx8="http://schemas.microsoft.com/office/drawing/2016/5/14/chartex" xmlns:mc="http://schemas.openxmlformats.org/markup-compatibility/2006" xmlns:aink="http://schemas.microsoft.com/office/drawing/2016/ink" xmlns:am3d="http://schemas.microsoft.com/office/drawing/2017/model3d" xmlns:o="urn:schemas-microsoft-com:office:office" xmlns:oel="http://schemas.microsoft.com/office/2019/extlst" xmlns:r="http://schemas.openxmlformats.org/officeDocument/2006/relationships" xmlns:m="http://schemas.openxmlformats.org/officeDocument/2006/math" xmlns:v="urn:schemas-microsoft-com:vml" xmlns:wp14="http://schemas.microsoft.com/office/word/2010/wordprocessingDrawing" xmlns:wp="http://schemas.openxmlformats.org/drawingml/2006/wordprocessingDrawing" xmlns:w10="urn:schemas-microsoft-com:office:word" xmlns:w="http://schemas.openxmlformats.org/wordprocessingml/2006/main" xmlns:w14="http://schemas.microsoft.com/office/word/2010/wordml" xmlns:w15="http://schemas.microsoft.com/office/word/2012/wordml" xmlns:w16cex="http://schemas.microsoft.com/office/word/2018/wordml/cex" xmlns:w16cid="http://schemas.microsoft.com/office/word/2016/wordml/cid" xmlns:w16="http://schemas.microsoft.com/office/word/2018/wordml" xmlns:w16sdtdh="http://schemas.microsoft.com/office/word/2020/wordml/sdtdatahash" xmlns:w16se="http://schemas.microsoft.com/office/word/2015/wordml/symex" xmlns:wpg="http://schemas.microsoft.com/office/word/2010/wordprocessingGroup" xmlns:wpi="http://schemas.microsoft.com/office/word/2010/wordprocessingInk" xmlns:wne="http://schemas.microsoft.com/office/word/2006/wordml" xmlns:wps="http://schemas.microsoft.com/office/word/2010/wordprocessingShape" mc:Ignorable="w14 w15 w16se w16cid w16 w16cex w16sdtdh wp14">
+  <w:endnote w:type="separator" w:id="-1">
+    <w:p>
+      <w:pPr>
+        <w:spacing w:after="0" w:line="240" w:lineRule="auto"/>
+      </w:pPr>
+      <w:r>
+        <w:separator/>
+      </w:r>
+    </w:p>
+  </w:endnote>
+  <w:endnote w:type="continuationSeparator" w:id="0">
+    <w:p>
+      <w:pPr>
+        <w:spacing w:after="0" w:line="240" w:lineRule="auto"/>
+      </w:pPr>
+      <w:r>
+        <w:continuationSeparator/>
+      </w:r>
+    </w:p>
+  </w:endnote>
+</w:endnotes>
+</file>
+
+<file path=word/footer1.xml><?xml version="1.0" encoding="utf-8"?>
+<w:ftr xmlns:wpc="http://schemas.microsoft.com/office/word/2010/wordprocessingCanvas" xmlns:cx="http://schemas.microsoft.com/office/drawing/2014/chartex" xmlns:cx1="http://schemas.microsoft.com/office/drawing/2015/9/8/chartex" xmlns:cx2="http://schemas.microsoft.com/office/drawing/2015/10/21/chartex" xmlns:cx3="http://schemas.microsoft.com/office/drawing/2016/5/9/chartex" xmlns:cx4="http://schemas.microsoft.com/office/drawing/2016/5/10/chartex" xmlns:cx5="http://schemas.microsoft.com/office/drawing/2016/5/11/chartex" xmlns:cx6="http://schemas.microsoft.com/office/drawing/2016/5/12/chartex" xmlns:cx7="http://schemas.microsoft.com/office/drawing/2016/5/13/chartex" xmlns:cx8="http://schemas.microsoft.com/office/drawing/2016/5/14/chartex" xmlns:mc="http://schemas.openxmlformats.org/markup-compatibility/2006" xmlns:aink="http://schemas.microsoft.com/office/drawing/2016/ink" xmlns:am3d="http://schemas.microsoft.com/office/drawing/2017/model3d" xmlns:o="urn:schemas-microsoft-com:office:office" xmlns:oel="http://schemas.microsoft.com/office/2019/extlst" xmlns:r="http://schemas.openxmlformats.org/officeDocument/2006/relationships" xmlns:m="http://schemas.openxmlformats.org/officeDocument/2006/math" xmlns:v="urn:schemas-microsoft-com:vml" xmlns:wp14="http://schemas.microsoft.com/office/word/2010/wordprocessingDrawing" xmlns:wp="http://schemas.openxmlformats.org/drawingml/2006/wordprocessingDrawing" xmlns:w10="urn:schemas-microsoft-com:office:word" xmlns:w="http://schemas.openxmlformats.org/wordprocessingml/2006/main" xmlns:w14="http://schemas.microsoft.com/office/word/2010/wordml" xmlns:w15="http://schemas.microsoft.com/office/word/2012/wordml" xmlns:w16cex="http://schemas.microsoft.com/office/word/2018/wordml/cex" xmlns:w16cid="http://schemas.microsoft.com/office/word/2016/wordml/cid" xmlns:w16="http://schemas.microsoft.com/office/word/2018/wordml" xmlns:w16sdtdh="http://schemas.microsoft.com/office/word/2020/wordml/sdtdatahash" xmlns:w16se="http://schemas.microsoft.com/office/word/2015/wordml/symex" xmlns:wpg="http://schemas.microsoft.com/office/word/2010/wordprocessingGroup" xmlns:wpi="http://schemas.microsoft.com/office/word/2010/wordprocessingInk" xmlns:wne="http://schemas.microsoft.com/office/word/2006/wordml" xmlns:wps="http://schemas.microsoft.com/office/word/2010/wordprocessingShape" mc:Ignorable="w14 w15 w16se w16cid w16 w16cex w16sdtdh wp14">
+  <w:sdt>
+    <w:sdtPr>
+      <w:id w:val="-1505053242"/>
+      <w:docPartObj>
+        <w:docPartGallery w:val="Page Numbers (Bottom of Page)"/>
+        <w:docPartUnique/>
+      </w:docPartObj>
+    </w:sdtPr>
+    <w:sdtEndPr>
+      <w:rPr>
+        <w:noProof/>
+      </w:rPr>
+    </w:sdtEndPr>
+    <w:sdtContent>
+      <w:p>
+        <w:pPr>
+          <w:pStyle w:val="Footer"/>
+          <w:jc w:val="center"/>
+        </w:pPr>
+        <w:r>
+          <w:fldChar w:fldCharType="begin"/>
+        </w:r>
+        <w:r>
+          <w:instrText xml:space="preserve"> PAGE   \* MERGEFORMAT </w:instrText>
+        </w:r>
+        <w:r>
+          <w:fldChar w:fldCharType="separate"/>
+        </w:r>
+        <w:r>
+          <w:rPr>
+            <w:noProof/>
+          </w:rPr>
+          <w:t>2</w:t>
+        </w:r>
+        <w:r>
+          <w:rPr>
+            <w:noProof/>
+          </w:rPr>
+          <w:fldChar w:fldCharType="end"/>
+        </w:r>
+      </w:p>
+    </w:sdtContent>
+  </w:sdt>
+  <w:p>
+    <w:pPr>
+      <w:pStyle w:val="Footer"/>
+    </w:pPr>
+  </w:p>
+</w:ftr>
+</file>
+
+<file path=word/footnotes.xml><?xml version="1.0" encoding="utf-8"?>
+<w:footnotes xmlns:wpc="http://schemas.microsoft.com/office/word/2010/wordprocessingCanvas" xmlns:cx="http://schemas.microsoft.com/office/drawing/2014/chartex" xmlns:cx1="http://schemas.microsoft.com/office/drawing/2015/9/8/chartex" xmlns:cx2="http://schemas.microsoft.com/office/drawing/2015/10/21/chartex" xmlns:cx3="http://schemas.microsoft.com/office/drawing/2016/5/9/chartex" xmlns:cx4="http://schemas.microsoft.com/office/drawing/2016/5/10/chartex" xmlns:cx5="http://schemas.microsoft.com/office/drawing/2016/5/11/chartex" xmlns:cx6="http://schemas.microsoft.com/office/drawing/2016/5/12/chartex" xmlns:cx7="http://schemas.microsoft.com/office/drawing/2016/5/13/chartex" xmlns:cx8="http://schemas.microsoft.com/office/drawing/2016/5/14/chartex" xmlns:mc="http://schemas.openxmlformats.org/markup-compatibility/2006" xmlns:aink="http://schemas.microsoft.com/office/drawing/2016/ink" xmlns:am3d="http://schemas.microsoft.com/office/drawing/2017/model3d" xmlns:o="urn:schemas-microsoft-com:office:office" xmlns:oel="http://schemas.microsoft.com/office/2019/extlst" xmlns:r="http://schemas.openxmlformats.org/officeDocument/2006/relationships" xmlns:m="http://schemas.openxmlformats.org/officeDocument/2006/math" xmlns:v="urn:schemas-microsoft-com:vml" xmlns:wp14="http://schemas.microsoft.com/office/word/2010/wordprocessingDrawing" xmlns:wp="http://schemas.openxmlformats.org/drawingml/2006/wordprocessingDrawing" xmlns:w10="urn:schemas-microsoft-com:office:word" xmlns:w="http://schemas.openxmlformats.org/wordprocessingml/2006/main" xmlns:w14="http://schemas.microsoft.com/office/word/2010/wordml" xmlns:w15="http://schemas.microsoft.com/office/word/2012/wordml" xmlns:w16cex="http://schemas.microsoft.com/office/word/2018/wordml/cex" xmlns:w16cid="http://schemas.microsoft.com/office/word/2016/wordml/cid" xmlns:w16="http://schemas.microsoft.com/office/word/2018/wordml" xmlns:w16sdtdh="http://schemas.microsoft.com/office/word/2020/wordml/sdtdatahash" xmlns:w16se="http://schemas.microsoft.com/office/word/2015/wordml/symex" xmlns:wpg="http://schemas.microsoft.com/office/word/2010/wordprocessingGroup" xmlns:wpi="http://schemas.microsoft.com/office/word/2010/wordprocessingInk" xmlns:wne="http://schemas.microsoft.com/office/word/2006/wordml" xmlns:wps="http://schemas.microsoft.com/office/word/2010/wordprocessingShape" mc:Ignorable="w14 w15 w16se w16cid w16 w16cex w16sdtdh wp14">
+  <w:footnote w:type="separator" w:id="-1">
+    <w:p>
+      <w:pPr>
+        <w:spacing w:after="0" w:line="240" w:lineRule="auto"/>
+      </w:pPr>
+      <w:r>
+        <w:separator/>
+      </w:r>
+    </w:p>
+  </w:footnote>
+  <w:footnote w:type="continuationSeparator" w:id="0">
+    <w:p>
+      <w:pPr>
+        <w:spacing w:after="0" w:line="240" w:lineRule="auto"/>
+      </w:pPr>
+      <w:r>
+        <w:continuationSeparator/>
+      </w:r>
+    </w:p>
+  </w:footnote>
+</w:footnotes>
+</file>
+
 <file path=word/numbering.xml><?xml version="1.0" encoding="utf-8"?>
 <w:numbering xmlns:wpc="http://schemas.microsoft.com/office/word/2010/wordprocessingCanvas" xmlns:cx="http://schemas.microsoft.com/office/drawing/2014/chartex" xmlns:cx1="http://schemas.microsoft.com/office/drawing/2015/9/8/chartex" xmlns:cx2="http://schemas.microsoft.com/office/drawing/2015/10/21/chartex" xmlns:cx3="http://schemas.microsoft.com/office/drawing/2016/5/9/chartex" xmlns:cx4="http://schemas.microsoft.com/office/drawing/2016/5/10/chartex" xmlns:cx5="http://schemas.microsoft.com/office/drawing/2016/5/11/chartex" xmlns:cx6="http://schemas.microsoft.com/office/drawing/2016/5/12/chartex" xmlns:cx7="http://schemas.microsoft.com/office/drawing/2016/5/13/chartex" xmlns:cx8="http://schemas.microsoft.com/office/drawing/2016/5/14/chartex" xmlns:mc="http://schemas.openxmlformats.org/markup-compatibility/2006" xmlns:aink="http://schemas.microsoft.com/office/drawing/2016/ink" xmlns:am3d="http://schemas.microsoft.com/office/drawing/2017/model3d" xmlns:o="urn:schemas-microsoft-com:office:office" xmlns:oel="http://schemas.microsoft.com/office/2019/extlst" xmlns:r="http://schemas.openxmlformats.org/officeDocument/2006/relationships" xmlns:m="http://schemas.openxmlformats.org/officeDocument/2006/math" xmlns:v="urn:schemas-microsoft-com:vml" xmlns:wp14="http://schemas.microsoft.com/office/word/2010/wordprocessingDrawing" xmlns:wp="http://schemas.openxmlformats.org/drawingml/2006/wordprocessingDrawing" xmlns:w10="urn:schemas-microsoft-com:office:word" xmlns:w="http://schemas.openxmlformats.org/wordprocessingml/2006/main" xmlns:w14="http://schemas.microsoft.com/office/word/2010/wordml" xmlns:w15="http://schemas.microsoft.com/office/word/2012/wordml" xmlns:w16cex="http://schemas.microsoft.com/office/word/2018/wordml/cex" xmlns:w16cid="http://schemas.microsoft.com/office/word/2016/wordml/cid" xmlns:w16="http://schemas.microsoft.com/office/word/2018/wordml" xmlns:w16sdtdh="http://schemas.microsoft.com/office/word/2020/wordml/sdtdatahash" xmlns:w16se="http://schemas.microsoft.com/office/word/2015/wordml/symex" xmlns:wpg="http://schemas.microsoft.com/office/word/2010/wordprocessingGroup" xmlns:wpi="http://schemas.microsoft.com/office/word/2010/wordprocessingInk" xmlns:wne="http://schemas.microsoft.com/office/word/2006/wordml" xmlns:wps="http://schemas.microsoft.com/office/word/2010/wordprocessingShape" mc:Ignorable="w14 w15 w16se w16cid w16 w16cex w16sdtdh wp14">
   <w:abstractNum w:abstractNumId="0" w15:restartNumberingAfterBreak="0">
-    <w:nsid w:val="3B7E7F64"/>
+    <w:nsid w:val="18C918A2"/>
     <w:multiLevelType w:val="hybridMultilevel"/>
-    <w:tmpl w:val="D46818D0"/>
+    <w:tmpl w:val="7DA2535E"/>
     <w:lvl w:ilvl="0" w:tplc="04090001">
       <w:start w:val="1"/>
       <w:numFmt w:val="bullet"/>
@@ -5282,16 +7584,256 @@
     </w:lvl>
   </w:abstractNum>
   <w:abstractNum w:abstractNumId="1" w15:restartNumberingAfterBreak="0">
-    <w:nsid w:val="4E4D2072"/>
+    <w:nsid w:val="1B181E63"/>
     <w:multiLevelType w:val="hybridMultilevel"/>
-    <w:tmpl w:val="D7F20568"/>
+    <w:tmpl w:val="A46681A0"/>
+    <w:lvl w:ilvl="0" w:tplc="591E5CFE">
+      <w:start w:val="1"/>
+      <w:numFmt w:val="decimal"/>
+      <w:lvlText w:val="%1."/>
+      <w:lvlJc w:val="left"/>
+      <w:pPr>
+        <w:ind w:left="360" w:hanging="360"/>
+      </w:pPr>
+      <w:rPr>
+        <w:rFonts w:hint="default"/>
+        <w:b/>
+        <w:bCs/>
+      </w:rPr>
+    </w:lvl>
+    <w:lvl w:ilvl="1" w:tplc="04090019" w:tentative="1">
+      <w:start w:val="1"/>
+      <w:numFmt w:val="lowerLetter"/>
+      <w:lvlText w:val="%2."/>
+      <w:lvlJc w:val="left"/>
+      <w:pPr>
+        <w:ind w:left="1080" w:hanging="360"/>
+      </w:pPr>
+    </w:lvl>
+    <w:lvl w:ilvl="2" w:tplc="0409001B" w:tentative="1">
+      <w:start w:val="1"/>
+      <w:numFmt w:val="lowerRoman"/>
+      <w:lvlText w:val="%3."/>
+      <w:lvlJc w:val="right"/>
+      <w:pPr>
+        <w:ind w:left="1800" w:hanging="180"/>
+      </w:pPr>
+    </w:lvl>
+    <w:lvl w:ilvl="3" w:tplc="0409000F" w:tentative="1">
+      <w:start w:val="1"/>
+      <w:numFmt w:val="decimal"/>
+      <w:lvlText w:val="%4."/>
+      <w:lvlJc w:val="left"/>
+      <w:pPr>
+        <w:ind w:left="2520" w:hanging="360"/>
+      </w:pPr>
+    </w:lvl>
+    <w:lvl w:ilvl="4" w:tplc="04090019" w:tentative="1">
+      <w:start w:val="1"/>
+      <w:numFmt w:val="lowerLetter"/>
+      <w:lvlText w:val="%5."/>
+      <w:lvlJc w:val="left"/>
+      <w:pPr>
+        <w:ind w:left="3240" w:hanging="360"/>
+      </w:pPr>
+    </w:lvl>
+    <w:lvl w:ilvl="5" w:tplc="0409001B" w:tentative="1">
+      <w:start w:val="1"/>
+      <w:numFmt w:val="lowerRoman"/>
+      <w:lvlText w:val="%6."/>
+      <w:lvlJc w:val="right"/>
+      <w:pPr>
+        <w:ind w:left="3960" w:hanging="180"/>
+      </w:pPr>
+    </w:lvl>
+    <w:lvl w:ilvl="6" w:tplc="0409000F" w:tentative="1">
+      <w:start w:val="1"/>
+      <w:numFmt w:val="decimal"/>
+      <w:lvlText w:val="%7."/>
+      <w:lvlJc w:val="left"/>
+      <w:pPr>
+        <w:ind w:left="4680" w:hanging="360"/>
+      </w:pPr>
+    </w:lvl>
+    <w:lvl w:ilvl="7" w:tplc="04090019" w:tentative="1">
+      <w:start w:val="1"/>
+      <w:numFmt w:val="lowerLetter"/>
+      <w:lvlText w:val="%8."/>
+      <w:lvlJc w:val="left"/>
+      <w:pPr>
+        <w:ind w:left="5400" w:hanging="360"/>
+      </w:pPr>
+    </w:lvl>
+    <w:lvl w:ilvl="8" w:tplc="0409001B" w:tentative="1">
+      <w:start w:val="1"/>
+      <w:numFmt w:val="lowerRoman"/>
+      <w:lvlText w:val="%9."/>
+      <w:lvlJc w:val="right"/>
+      <w:pPr>
+        <w:ind w:left="6120" w:hanging="180"/>
+      </w:pPr>
+    </w:lvl>
+  </w:abstractNum>
+  <w:abstractNum w:abstractNumId="2" w15:restartNumberingAfterBreak="0">
+    <w:nsid w:val="2EBD4BC7"/>
+    <w:multiLevelType w:val="multilevel"/>
+    <w:tmpl w:val="CEDEAA88"/>
+    <w:lvl w:ilvl="0">
+      <w:start w:val="1"/>
+      <w:numFmt w:val="bullet"/>
+      <w:lvlText w:val=""/>
+      <w:lvlJc w:val="left"/>
+      <w:pPr>
+        <w:tabs>
+          <w:tab w:val="num" w:pos="720"/>
+        </w:tabs>
+        <w:ind w:left="720" w:hanging="360"/>
+      </w:pPr>
+      <w:rPr>
+        <w:rFonts w:ascii="Symbol" w:hAnsi="Symbol" w:hint="default"/>
+        <w:sz w:val="20"/>
+      </w:rPr>
+    </w:lvl>
+    <w:lvl w:ilvl="1" w:tentative="1">
+      <w:start w:val="1"/>
+      <w:numFmt w:val="bullet"/>
+      <w:lvlText w:val="o"/>
+      <w:lvlJc w:val="left"/>
+      <w:pPr>
+        <w:tabs>
+          <w:tab w:val="num" w:pos="1440"/>
+        </w:tabs>
+        <w:ind w:left="1440" w:hanging="360"/>
+      </w:pPr>
+      <w:rPr>
+        <w:rFonts w:ascii="Courier New" w:hAnsi="Courier New" w:hint="default"/>
+        <w:sz w:val="20"/>
+      </w:rPr>
+    </w:lvl>
+    <w:lvl w:ilvl="2" w:tentative="1">
+      <w:start w:val="1"/>
+      <w:numFmt w:val="bullet"/>
+      <w:lvlText w:val=""/>
+      <w:lvlJc w:val="left"/>
+      <w:pPr>
+        <w:tabs>
+          <w:tab w:val="num" w:pos="2160"/>
+        </w:tabs>
+        <w:ind w:left="2160" w:hanging="360"/>
+      </w:pPr>
+      <w:rPr>
+        <w:rFonts w:ascii="Wingdings" w:hAnsi="Wingdings" w:hint="default"/>
+        <w:sz w:val="20"/>
+      </w:rPr>
+    </w:lvl>
+    <w:lvl w:ilvl="3" w:tentative="1">
+      <w:start w:val="1"/>
+      <w:numFmt w:val="bullet"/>
+      <w:lvlText w:val=""/>
+      <w:lvlJc w:val="left"/>
+      <w:pPr>
+        <w:tabs>
+          <w:tab w:val="num" w:pos="2880"/>
+        </w:tabs>
+        <w:ind w:left="2880" w:hanging="360"/>
+      </w:pPr>
+      <w:rPr>
+        <w:rFonts w:ascii="Wingdings" w:hAnsi="Wingdings" w:hint="default"/>
+        <w:sz w:val="20"/>
+      </w:rPr>
+    </w:lvl>
+    <w:lvl w:ilvl="4" w:tentative="1">
+      <w:start w:val="1"/>
+      <w:numFmt w:val="bullet"/>
+      <w:lvlText w:val=""/>
+      <w:lvlJc w:val="left"/>
+      <w:pPr>
+        <w:tabs>
+          <w:tab w:val="num" w:pos="3600"/>
+        </w:tabs>
+        <w:ind w:left="3600" w:hanging="360"/>
+      </w:pPr>
+      <w:rPr>
+        <w:rFonts w:ascii="Wingdings" w:hAnsi="Wingdings" w:hint="default"/>
+        <w:sz w:val="20"/>
+      </w:rPr>
+    </w:lvl>
+    <w:lvl w:ilvl="5" w:tentative="1">
+      <w:start w:val="1"/>
+      <w:numFmt w:val="bullet"/>
+      <w:lvlText w:val=""/>
+      <w:lvlJc w:val="left"/>
+      <w:pPr>
+        <w:tabs>
+          <w:tab w:val="num" w:pos="4320"/>
+        </w:tabs>
+        <w:ind w:left="4320" w:hanging="360"/>
+      </w:pPr>
+      <w:rPr>
+        <w:rFonts w:ascii="Wingdings" w:hAnsi="Wingdings" w:hint="default"/>
+        <w:sz w:val="20"/>
+      </w:rPr>
+    </w:lvl>
+    <w:lvl w:ilvl="6" w:tentative="1">
+      <w:start w:val="1"/>
+      <w:numFmt w:val="bullet"/>
+      <w:lvlText w:val=""/>
+      <w:lvlJc w:val="left"/>
+      <w:pPr>
+        <w:tabs>
+          <w:tab w:val="num" w:pos="5040"/>
+        </w:tabs>
+        <w:ind w:left="5040" w:hanging="360"/>
+      </w:pPr>
+      <w:rPr>
+        <w:rFonts w:ascii="Wingdings" w:hAnsi="Wingdings" w:hint="default"/>
+        <w:sz w:val="20"/>
+      </w:rPr>
+    </w:lvl>
+    <w:lvl w:ilvl="7" w:tentative="1">
+      <w:start w:val="1"/>
+      <w:numFmt w:val="bullet"/>
+      <w:lvlText w:val=""/>
+      <w:lvlJc w:val="left"/>
+      <w:pPr>
+        <w:tabs>
+          <w:tab w:val="num" w:pos="5760"/>
+        </w:tabs>
+        <w:ind w:left="5760" w:hanging="360"/>
+      </w:pPr>
+      <w:rPr>
+        <w:rFonts w:ascii="Wingdings" w:hAnsi="Wingdings" w:hint="default"/>
+        <w:sz w:val="20"/>
+      </w:rPr>
+    </w:lvl>
+    <w:lvl w:ilvl="8" w:tentative="1">
+      <w:start w:val="1"/>
+      <w:numFmt w:val="bullet"/>
+      <w:lvlText w:val=""/>
+      <w:lvlJc w:val="left"/>
+      <w:pPr>
+        <w:tabs>
+          <w:tab w:val="num" w:pos="6480"/>
+        </w:tabs>
+        <w:ind w:left="6480" w:hanging="360"/>
+      </w:pPr>
+      <w:rPr>
+        <w:rFonts w:ascii="Wingdings" w:hAnsi="Wingdings" w:hint="default"/>
+        <w:sz w:val="20"/>
+      </w:rPr>
+    </w:lvl>
+  </w:abstractNum>
+  <w:abstractNum w:abstractNumId="3" w15:restartNumberingAfterBreak="0">
+    <w:nsid w:val="3B7E7F64"/>
+    <w:multiLevelType w:val="hybridMultilevel"/>
+    <w:tmpl w:val="D46818D0"/>
     <w:lvl w:ilvl="0" w:tplc="04090001">
       <w:start w:val="1"/>
       <w:numFmt w:val="bullet"/>
       <w:lvlText w:val=""/>
       <w:lvlJc w:val="left"/>
       <w:pPr>
-        <w:ind w:left="0" w:hanging="360"/>
+        <w:ind w:left="360" w:hanging="360"/>
       </w:pPr>
       <w:rPr>
         <w:rFonts w:ascii="Symbol" w:hAnsi="Symbol" w:hint="default"/>
@@ -5303,7 +7845,7 @@
       <w:lvlText w:val="o"/>
       <w:lvlJc w:val="left"/>
       <w:pPr>
-        <w:ind w:left="720" w:hanging="360"/>
+        <w:ind w:left="1080" w:hanging="360"/>
       </w:pPr>
       <w:rPr>
         <w:rFonts w:ascii="Courier New" w:hAnsi="Courier New" w:cs="Courier New" w:hint="default"/>
@@ -5315,7 +7857,7 @@
       <w:lvlText w:val=""/>
       <w:lvlJc w:val="left"/>
       <w:pPr>
-        <w:ind w:left="1440" w:hanging="360"/>
+        <w:ind w:left="1800" w:hanging="360"/>
       </w:pPr>
       <w:rPr>
         <w:rFonts w:ascii="Wingdings" w:hAnsi="Wingdings" w:hint="default"/>
@@ -5327,7 +7869,7 @@
       <w:lvlText w:val=""/>
       <w:lvlJc w:val="left"/>
       <w:pPr>
-        <w:ind w:left="2160" w:hanging="360"/>
+        <w:ind w:left="2520" w:hanging="360"/>
       </w:pPr>
       <w:rPr>
         <w:rFonts w:ascii="Symbol" w:hAnsi="Symbol" w:hint="default"/>
@@ -5339,7 +7881,7 @@
       <w:lvlText w:val="o"/>
       <w:lvlJc w:val="left"/>
       <w:pPr>
-        <w:ind w:left="2880" w:hanging="360"/>
+        <w:ind w:left="3240" w:hanging="360"/>
       </w:pPr>
       <w:rPr>
         <w:rFonts w:ascii="Courier New" w:hAnsi="Courier New" w:cs="Courier New" w:hint="default"/>
@@ -5351,7 +7893,7 @@
       <w:lvlText w:val=""/>
       <w:lvlJc w:val="left"/>
       <w:pPr>
-        <w:ind w:left="3600" w:hanging="360"/>
+        <w:ind w:left="3960" w:hanging="360"/>
       </w:pPr>
       <w:rPr>
         <w:rFonts w:ascii="Wingdings" w:hAnsi="Wingdings" w:hint="default"/>
@@ -5363,7 +7905,7 @@
       <w:lvlText w:val=""/>
       <w:lvlJc w:val="left"/>
       <w:pPr>
-        <w:ind w:left="4320" w:hanging="360"/>
+        <w:ind w:left="4680" w:hanging="360"/>
       </w:pPr>
       <w:rPr>
         <w:rFonts w:ascii="Symbol" w:hAnsi="Symbol" w:hint="default"/>
@@ -5375,7 +7917,7 @@
       <w:lvlText w:val="o"/>
       <w:lvlJc w:val="left"/>
       <w:pPr>
-        <w:ind w:left="5040" w:hanging="360"/>
+        <w:ind w:left="5400" w:hanging="360"/>
       </w:pPr>
       <w:rPr>
         <w:rFonts w:ascii="Courier New" w:hAnsi="Courier New" w:cs="Courier New" w:hint="default"/>
@@ -5387,17 +7929,17 @@
       <w:lvlText w:val=""/>
       <w:lvlJc w:val="left"/>
       <w:pPr>
-        <w:ind w:left="5760" w:hanging="360"/>
+        <w:ind w:left="6120" w:hanging="360"/>
       </w:pPr>
       <w:rPr>
         <w:rFonts w:ascii="Wingdings" w:hAnsi="Wingdings" w:hint="default"/>
       </w:rPr>
     </w:lvl>
   </w:abstractNum>
-  <w:abstractNum w:abstractNumId="2" w15:restartNumberingAfterBreak="0">
-    <w:nsid w:val="5B617127"/>
+  <w:abstractNum w:abstractNumId="4" w15:restartNumberingAfterBreak="0">
+    <w:nsid w:val="4C5D4AB9"/>
     <w:multiLevelType w:val="hybridMultilevel"/>
-    <w:tmpl w:val="6CD48A7A"/>
+    <w:tmpl w:val="B784F262"/>
     <w:lvl w:ilvl="0" w:tplc="04090001">
       <w:start w:val="1"/>
       <w:numFmt w:val="bullet"/>
@@ -5507,17 +8049,17 @@
       </w:rPr>
     </w:lvl>
   </w:abstractNum>
-  <w:abstractNum w:abstractNumId="3" w15:restartNumberingAfterBreak="0">
-    <w:nsid w:val="6E5512B8"/>
+  <w:abstractNum w:abstractNumId="5" w15:restartNumberingAfterBreak="0">
+    <w:nsid w:val="4E4D2072"/>
     <w:multiLevelType w:val="hybridMultilevel"/>
-    <w:tmpl w:val="BC9E8E0E"/>
+    <w:tmpl w:val="D7F20568"/>
     <w:lvl w:ilvl="0" w:tplc="04090001">
       <w:start w:val="1"/>
       <w:numFmt w:val="bullet"/>
       <w:lvlText w:val=""/>
       <w:lvlJc w:val="left"/>
       <w:pPr>
-        <w:ind w:left="360" w:hanging="360"/>
+        <w:ind w:left="0" w:hanging="360"/>
       </w:pPr>
       <w:rPr>
         <w:rFonts w:ascii="Symbol" w:hAnsi="Symbol" w:hint="default"/>
@@ -5529,7 +8071,7 @@
       <w:lvlText w:val="o"/>
       <w:lvlJc w:val="left"/>
       <w:pPr>
-        <w:ind w:left="1080" w:hanging="360"/>
+        <w:ind w:left="720" w:hanging="360"/>
       </w:pPr>
       <w:rPr>
         <w:rFonts w:ascii="Courier New" w:hAnsi="Courier New" w:cs="Courier New" w:hint="default"/>
@@ -5541,7 +8083,7 @@
       <w:lvlText w:val=""/>
       <w:lvlJc w:val="left"/>
       <w:pPr>
-        <w:ind w:left="1800" w:hanging="360"/>
+        <w:ind w:left="1440" w:hanging="360"/>
       </w:pPr>
       <w:rPr>
         <w:rFonts w:ascii="Wingdings" w:hAnsi="Wingdings" w:hint="default"/>
@@ -5553,7 +8095,7 @@
       <w:lvlText w:val=""/>
       <w:lvlJc w:val="left"/>
       <w:pPr>
-        <w:ind w:left="2520" w:hanging="360"/>
+        <w:ind w:left="2160" w:hanging="360"/>
       </w:pPr>
       <w:rPr>
         <w:rFonts w:ascii="Symbol" w:hAnsi="Symbol" w:hint="default"/>
@@ -5565,7 +8107,7 @@
       <w:lvlText w:val="o"/>
       <w:lvlJc w:val="left"/>
       <w:pPr>
-        <w:ind w:left="3240" w:hanging="360"/>
+        <w:ind w:left="2880" w:hanging="360"/>
       </w:pPr>
       <w:rPr>
         <w:rFonts w:ascii="Courier New" w:hAnsi="Courier New" w:cs="Courier New" w:hint="default"/>
@@ -5577,7 +8119,7 @@
       <w:lvlText w:val=""/>
       <w:lvlJc w:val="left"/>
       <w:pPr>
-        <w:ind w:left="3960" w:hanging="360"/>
+        <w:ind w:left="3600" w:hanging="360"/>
       </w:pPr>
       <w:rPr>
         <w:rFonts w:ascii="Wingdings" w:hAnsi="Wingdings" w:hint="default"/>
@@ -5589,7 +8131,7 @@
       <w:lvlText w:val=""/>
       <w:lvlJc w:val="left"/>
       <w:pPr>
-        <w:ind w:left="4680" w:hanging="360"/>
+        <w:ind w:left="4320" w:hanging="360"/>
       </w:pPr>
       <w:rPr>
         <w:rFonts w:ascii="Symbol" w:hAnsi="Symbol" w:hint="default"/>
@@ -5601,7 +8143,7 @@
       <w:lvlText w:val="o"/>
       <w:lvlJc w:val="left"/>
       <w:pPr>
-        <w:ind w:left="5400" w:hanging="360"/>
+        <w:ind w:left="5040" w:hanging="360"/>
       </w:pPr>
       <w:rPr>
         <w:rFonts w:ascii="Courier New" w:hAnsi="Courier New" w:cs="Courier New" w:hint="default"/>
@@ -5613,7 +8155,346 @@
       <w:lvlText w:val=""/>
       <w:lvlJc w:val="left"/>
       <w:pPr>
+        <w:ind w:left="5760" w:hanging="360"/>
+      </w:pPr>
+      <w:rPr>
+        <w:rFonts w:ascii="Wingdings" w:hAnsi="Wingdings" w:hint="default"/>
+      </w:rPr>
+    </w:lvl>
+  </w:abstractNum>
+  <w:abstractNum w:abstractNumId="6" w15:restartNumberingAfterBreak="0">
+    <w:nsid w:val="5B617127"/>
+    <w:multiLevelType w:val="hybridMultilevel"/>
+    <w:tmpl w:val="6CD48A7A"/>
+    <w:lvl w:ilvl="0" w:tplc="04090001">
+      <w:start w:val="1"/>
+      <w:numFmt w:val="bullet"/>
+      <w:lvlText w:val=""/>
+      <w:lvlJc w:val="left"/>
+      <w:pPr>
+        <w:ind w:left="360" w:hanging="360"/>
+      </w:pPr>
+      <w:rPr>
+        <w:rFonts w:ascii="Symbol" w:hAnsi="Symbol" w:hint="default"/>
+      </w:rPr>
+    </w:lvl>
+    <w:lvl w:ilvl="1" w:tplc="04090003" w:tentative="1">
+      <w:start w:val="1"/>
+      <w:numFmt w:val="bullet"/>
+      <w:lvlText w:val="o"/>
+      <w:lvlJc w:val="left"/>
+      <w:pPr>
+        <w:ind w:left="1080" w:hanging="360"/>
+      </w:pPr>
+      <w:rPr>
+        <w:rFonts w:ascii="Courier New" w:hAnsi="Courier New" w:cs="Courier New" w:hint="default"/>
+      </w:rPr>
+    </w:lvl>
+    <w:lvl w:ilvl="2" w:tplc="04090005" w:tentative="1">
+      <w:start w:val="1"/>
+      <w:numFmt w:val="bullet"/>
+      <w:lvlText w:val=""/>
+      <w:lvlJc w:val="left"/>
+      <w:pPr>
+        <w:ind w:left="1800" w:hanging="360"/>
+      </w:pPr>
+      <w:rPr>
+        <w:rFonts w:ascii="Wingdings" w:hAnsi="Wingdings" w:hint="default"/>
+      </w:rPr>
+    </w:lvl>
+    <w:lvl w:ilvl="3" w:tplc="04090001" w:tentative="1">
+      <w:start w:val="1"/>
+      <w:numFmt w:val="bullet"/>
+      <w:lvlText w:val=""/>
+      <w:lvlJc w:val="left"/>
+      <w:pPr>
+        <w:ind w:left="2520" w:hanging="360"/>
+      </w:pPr>
+      <w:rPr>
+        <w:rFonts w:ascii="Symbol" w:hAnsi="Symbol" w:hint="default"/>
+      </w:rPr>
+    </w:lvl>
+    <w:lvl w:ilvl="4" w:tplc="04090003" w:tentative="1">
+      <w:start w:val="1"/>
+      <w:numFmt w:val="bullet"/>
+      <w:lvlText w:val="o"/>
+      <w:lvlJc w:val="left"/>
+      <w:pPr>
+        <w:ind w:left="3240" w:hanging="360"/>
+      </w:pPr>
+      <w:rPr>
+        <w:rFonts w:ascii="Courier New" w:hAnsi="Courier New" w:cs="Courier New" w:hint="default"/>
+      </w:rPr>
+    </w:lvl>
+    <w:lvl w:ilvl="5" w:tplc="04090005" w:tentative="1">
+      <w:start w:val="1"/>
+      <w:numFmt w:val="bullet"/>
+      <w:lvlText w:val=""/>
+      <w:lvlJc w:val="left"/>
+      <w:pPr>
+        <w:ind w:left="3960" w:hanging="360"/>
+      </w:pPr>
+      <w:rPr>
+        <w:rFonts w:ascii="Wingdings" w:hAnsi="Wingdings" w:hint="default"/>
+      </w:rPr>
+    </w:lvl>
+    <w:lvl w:ilvl="6" w:tplc="04090001" w:tentative="1">
+      <w:start w:val="1"/>
+      <w:numFmt w:val="bullet"/>
+      <w:lvlText w:val=""/>
+      <w:lvlJc w:val="left"/>
+      <w:pPr>
+        <w:ind w:left="4680" w:hanging="360"/>
+      </w:pPr>
+      <w:rPr>
+        <w:rFonts w:ascii="Symbol" w:hAnsi="Symbol" w:hint="default"/>
+      </w:rPr>
+    </w:lvl>
+    <w:lvl w:ilvl="7" w:tplc="04090003" w:tentative="1">
+      <w:start w:val="1"/>
+      <w:numFmt w:val="bullet"/>
+      <w:lvlText w:val="o"/>
+      <w:lvlJc w:val="left"/>
+      <w:pPr>
+        <w:ind w:left="5400" w:hanging="360"/>
+      </w:pPr>
+      <w:rPr>
+        <w:rFonts w:ascii="Courier New" w:hAnsi="Courier New" w:cs="Courier New" w:hint="default"/>
+      </w:rPr>
+    </w:lvl>
+    <w:lvl w:ilvl="8" w:tplc="04090005" w:tentative="1">
+      <w:start w:val="1"/>
+      <w:numFmt w:val="bullet"/>
+      <w:lvlText w:val=""/>
+      <w:lvlJc w:val="left"/>
+      <w:pPr>
         <w:ind w:left="6120" w:hanging="360"/>
+      </w:pPr>
+      <w:rPr>
+        <w:rFonts w:ascii="Wingdings" w:hAnsi="Wingdings" w:hint="default"/>
+      </w:rPr>
+    </w:lvl>
+  </w:abstractNum>
+  <w:abstractNum w:abstractNumId="7" w15:restartNumberingAfterBreak="0">
+    <w:nsid w:val="6E5512B8"/>
+    <w:multiLevelType w:val="hybridMultilevel"/>
+    <w:tmpl w:val="BC9E8E0E"/>
+    <w:lvl w:ilvl="0" w:tplc="04090001">
+      <w:start w:val="1"/>
+      <w:numFmt w:val="bullet"/>
+      <w:lvlText w:val=""/>
+      <w:lvlJc w:val="left"/>
+      <w:pPr>
+        <w:ind w:left="360" w:hanging="360"/>
+      </w:pPr>
+      <w:rPr>
+        <w:rFonts w:ascii="Symbol" w:hAnsi="Symbol" w:hint="default"/>
+      </w:rPr>
+    </w:lvl>
+    <w:lvl w:ilvl="1" w:tplc="04090003" w:tentative="1">
+      <w:start w:val="1"/>
+      <w:numFmt w:val="bullet"/>
+      <w:lvlText w:val="o"/>
+      <w:lvlJc w:val="left"/>
+      <w:pPr>
+        <w:ind w:left="1080" w:hanging="360"/>
+      </w:pPr>
+      <w:rPr>
+        <w:rFonts w:ascii="Courier New" w:hAnsi="Courier New" w:cs="Courier New" w:hint="default"/>
+      </w:rPr>
+    </w:lvl>
+    <w:lvl w:ilvl="2" w:tplc="04090005" w:tentative="1">
+      <w:start w:val="1"/>
+      <w:numFmt w:val="bullet"/>
+      <w:lvlText w:val=""/>
+      <w:lvlJc w:val="left"/>
+      <w:pPr>
+        <w:ind w:left="1800" w:hanging="360"/>
+      </w:pPr>
+      <w:rPr>
+        <w:rFonts w:ascii="Wingdings" w:hAnsi="Wingdings" w:hint="default"/>
+      </w:rPr>
+    </w:lvl>
+    <w:lvl w:ilvl="3" w:tplc="04090001" w:tentative="1">
+      <w:start w:val="1"/>
+      <w:numFmt w:val="bullet"/>
+      <w:lvlText w:val=""/>
+      <w:lvlJc w:val="left"/>
+      <w:pPr>
+        <w:ind w:left="2520" w:hanging="360"/>
+      </w:pPr>
+      <w:rPr>
+        <w:rFonts w:ascii="Symbol" w:hAnsi="Symbol" w:hint="default"/>
+      </w:rPr>
+    </w:lvl>
+    <w:lvl w:ilvl="4" w:tplc="04090003" w:tentative="1">
+      <w:start w:val="1"/>
+      <w:numFmt w:val="bullet"/>
+      <w:lvlText w:val="o"/>
+      <w:lvlJc w:val="left"/>
+      <w:pPr>
+        <w:ind w:left="3240" w:hanging="360"/>
+      </w:pPr>
+      <w:rPr>
+        <w:rFonts w:ascii="Courier New" w:hAnsi="Courier New" w:cs="Courier New" w:hint="default"/>
+      </w:rPr>
+    </w:lvl>
+    <w:lvl w:ilvl="5" w:tplc="04090005" w:tentative="1">
+      <w:start w:val="1"/>
+      <w:numFmt w:val="bullet"/>
+      <w:lvlText w:val=""/>
+      <w:lvlJc w:val="left"/>
+      <w:pPr>
+        <w:ind w:left="3960" w:hanging="360"/>
+      </w:pPr>
+      <w:rPr>
+        <w:rFonts w:ascii="Wingdings" w:hAnsi="Wingdings" w:hint="default"/>
+      </w:rPr>
+    </w:lvl>
+    <w:lvl w:ilvl="6" w:tplc="04090001" w:tentative="1">
+      <w:start w:val="1"/>
+      <w:numFmt w:val="bullet"/>
+      <w:lvlText w:val=""/>
+      <w:lvlJc w:val="left"/>
+      <w:pPr>
+        <w:ind w:left="4680" w:hanging="360"/>
+      </w:pPr>
+      <w:rPr>
+        <w:rFonts w:ascii="Symbol" w:hAnsi="Symbol" w:hint="default"/>
+      </w:rPr>
+    </w:lvl>
+    <w:lvl w:ilvl="7" w:tplc="04090003" w:tentative="1">
+      <w:start w:val="1"/>
+      <w:numFmt w:val="bullet"/>
+      <w:lvlText w:val="o"/>
+      <w:lvlJc w:val="left"/>
+      <w:pPr>
+        <w:ind w:left="5400" w:hanging="360"/>
+      </w:pPr>
+      <w:rPr>
+        <w:rFonts w:ascii="Courier New" w:hAnsi="Courier New" w:cs="Courier New" w:hint="default"/>
+      </w:rPr>
+    </w:lvl>
+    <w:lvl w:ilvl="8" w:tplc="04090005" w:tentative="1">
+      <w:start w:val="1"/>
+      <w:numFmt w:val="bullet"/>
+      <w:lvlText w:val=""/>
+      <w:lvlJc w:val="left"/>
+      <w:pPr>
+        <w:ind w:left="6120" w:hanging="360"/>
+      </w:pPr>
+      <w:rPr>
+        <w:rFonts w:ascii="Wingdings" w:hAnsi="Wingdings" w:hint="default"/>
+      </w:rPr>
+    </w:lvl>
+  </w:abstractNum>
+  <w:abstractNum w:abstractNumId="8" w15:restartNumberingAfterBreak="0">
+    <w:nsid w:val="7B4C64D7"/>
+    <w:multiLevelType w:val="hybridMultilevel"/>
+    <w:tmpl w:val="D4D23314"/>
+    <w:lvl w:ilvl="0" w:tplc="04090001">
+      <w:start w:val="1"/>
+      <w:numFmt w:val="bullet"/>
+      <w:lvlText w:val=""/>
+      <w:lvlJc w:val="left"/>
+      <w:pPr>
+        <w:ind w:left="450" w:hanging="360"/>
+      </w:pPr>
+      <w:rPr>
+        <w:rFonts w:ascii="Symbol" w:hAnsi="Symbol" w:hint="default"/>
+      </w:rPr>
+    </w:lvl>
+    <w:lvl w:ilvl="1" w:tplc="04090003" w:tentative="1">
+      <w:start w:val="1"/>
+      <w:numFmt w:val="bullet"/>
+      <w:lvlText w:val="o"/>
+      <w:lvlJc w:val="left"/>
+      <w:pPr>
+        <w:ind w:left="1170" w:hanging="360"/>
+      </w:pPr>
+      <w:rPr>
+        <w:rFonts w:ascii="Courier New" w:hAnsi="Courier New" w:cs="Courier New" w:hint="default"/>
+      </w:rPr>
+    </w:lvl>
+    <w:lvl w:ilvl="2" w:tplc="04090005" w:tentative="1">
+      <w:start w:val="1"/>
+      <w:numFmt w:val="bullet"/>
+      <w:lvlText w:val=""/>
+      <w:lvlJc w:val="left"/>
+      <w:pPr>
+        <w:ind w:left="1890" w:hanging="360"/>
+      </w:pPr>
+      <w:rPr>
+        <w:rFonts w:ascii="Wingdings" w:hAnsi="Wingdings" w:hint="default"/>
+      </w:rPr>
+    </w:lvl>
+    <w:lvl w:ilvl="3" w:tplc="04090001" w:tentative="1">
+      <w:start w:val="1"/>
+      <w:numFmt w:val="bullet"/>
+      <w:lvlText w:val=""/>
+      <w:lvlJc w:val="left"/>
+      <w:pPr>
+        <w:ind w:left="2610" w:hanging="360"/>
+      </w:pPr>
+      <w:rPr>
+        <w:rFonts w:ascii="Symbol" w:hAnsi="Symbol" w:hint="default"/>
+      </w:rPr>
+    </w:lvl>
+    <w:lvl w:ilvl="4" w:tplc="04090003" w:tentative="1">
+      <w:start w:val="1"/>
+      <w:numFmt w:val="bullet"/>
+      <w:lvlText w:val="o"/>
+      <w:lvlJc w:val="left"/>
+      <w:pPr>
+        <w:ind w:left="3330" w:hanging="360"/>
+      </w:pPr>
+      <w:rPr>
+        <w:rFonts w:ascii="Courier New" w:hAnsi="Courier New" w:cs="Courier New" w:hint="default"/>
+      </w:rPr>
+    </w:lvl>
+    <w:lvl w:ilvl="5" w:tplc="04090005" w:tentative="1">
+      <w:start w:val="1"/>
+      <w:numFmt w:val="bullet"/>
+      <w:lvlText w:val=""/>
+      <w:lvlJc w:val="left"/>
+      <w:pPr>
+        <w:ind w:left="4050" w:hanging="360"/>
+      </w:pPr>
+      <w:rPr>
+        <w:rFonts w:ascii="Wingdings" w:hAnsi="Wingdings" w:hint="default"/>
+      </w:rPr>
+    </w:lvl>
+    <w:lvl w:ilvl="6" w:tplc="04090001" w:tentative="1">
+      <w:start w:val="1"/>
+      <w:numFmt w:val="bullet"/>
+      <w:lvlText w:val=""/>
+      <w:lvlJc w:val="left"/>
+      <w:pPr>
+        <w:ind w:left="4770" w:hanging="360"/>
+      </w:pPr>
+      <w:rPr>
+        <w:rFonts w:ascii="Symbol" w:hAnsi="Symbol" w:hint="default"/>
+      </w:rPr>
+    </w:lvl>
+    <w:lvl w:ilvl="7" w:tplc="04090003" w:tentative="1">
+      <w:start w:val="1"/>
+      <w:numFmt w:val="bullet"/>
+      <w:lvlText w:val="o"/>
+      <w:lvlJc w:val="left"/>
+      <w:pPr>
+        <w:ind w:left="5490" w:hanging="360"/>
+      </w:pPr>
+      <w:rPr>
+        <w:rFonts w:ascii="Courier New" w:hAnsi="Courier New" w:cs="Courier New" w:hint="default"/>
+      </w:rPr>
+    </w:lvl>
+    <w:lvl w:ilvl="8" w:tplc="04090005" w:tentative="1">
+      <w:start w:val="1"/>
+      <w:numFmt w:val="bullet"/>
+      <w:lvlText w:val=""/>
+      <w:lvlJc w:val="left"/>
+      <w:pPr>
+        <w:ind w:left="6210" w:hanging="360"/>
       </w:pPr>
       <w:rPr>
         <w:rFonts w:ascii="Wingdings" w:hAnsi="Wingdings" w:hint="default"/>
@@ -5621,16 +8502,31 @@
     </w:lvl>
   </w:abstractNum>
   <w:num w:numId="1" w16cid:durableId="1996840754">
+    <w:abstractNumId w:val="5"/>
+  </w:num>
+  <w:num w:numId="2" w16cid:durableId="1990666938">
+    <w:abstractNumId w:val="7"/>
+  </w:num>
+  <w:num w:numId="3" w16cid:durableId="1451707078">
+    <w:abstractNumId w:val="6"/>
+  </w:num>
+  <w:num w:numId="4" w16cid:durableId="1146817490">
+    <w:abstractNumId w:val="3"/>
+  </w:num>
+  <w:num w:numId="5" w16cid:durableId="858276934">
     <w:abstractNumId w:val="1"/>
   </w:num>
-  <w:num w:numId="2" w16cid:durableId="1990666938">
-    <w:abstractNumId w:val="3"/>
-  </w:num>
-  <w:num w:numId="3" w16cid:durableId="1451707078">
+  <w:num w:numId="6" w16cid:durableId="1289438031">
     <w:abstractNumId w:val="2"/>
   </w:num>
-  <w:num w:numId="4" w16cid:durableId="1146817490">
+  <w:num w:numId="7" w16cid:durableId="1088188182">
+    <w:abstractNumId w:val="8"/>
+  </w:num>
+  <w:num w:numId="8" w16cid:durableId="1458524996">
     <w:abstractNumId w:val="0"/>
+  </w:num>
+  <w:num w:numId="9" w16cid:durableId="788281946">
+    <w:abstractNumId w:val="4"/>
   </w:num>
 </w:numbering>
 </file>
@@ -6086,7 +8982,6 @@
     <w:next w:val="Normal"/>
     <w:link w:val="Heading3Char"/>
     <w:uiPriority w:val="9"/>
-    <w:semiHidden/>
     <w:unhideWhenUsed/>
     <w:qFormat/>
     <w:rsid w:val="001F1CEB"/>
@@ -6238,7 +9133,6 @@
   <w:style w:type="character" w:default="1" w:styleId="DefaultParagraphFont">
     <w:name w:val="Default Paragraph Font"/>
     <w:uiPriority w:val="1"/>
-    <w:semiHidden/>
     <w:unhideWhenUsed/>
   </w:style>
   <w:style w:type="table" w:default="1" w:styleId="TableNormal">
@@ -6294,7 +9188,6 @@
     <w:basedOn w:val="DefaultParagraphFont"/>
     <w:link w:val="Heading3"/>
     <w:uiPriority w:val="9"/>
-    <w:semiHidden/>
     <w:rsid w:val="001F1CEB"/>
     <w:rPr>
       <w:rFonts w:eastAsiaTheme="majorEastAsia" w:cstheme="majorBidi"/>
@@ -6639,6 +9532,50 @@
       </w:tcPr>
     </w:tblStylePr>
   </w:style>
+  <w:style w:type="paragraph" w:styleId="Header">
+    <w:name w:val="header"/>
+    <w:basedOn w:val="Normal"/>
+    <w:link w:val="HeaderChar"/>
+    <w:uiPriority w:val="99"/>
+    <w:unhideWhenUsed/>
+    <w:rsid w:val="00EE13AF"/>
+    <w:pPr>
+      <w:tabs>
+        <w:tab w:val="center" w:pos="4680"/>
+        <w:tab w:val="right" w:pos="9360"/>
+      </w:tabs>
+      <w:spacing w:after="0" w:line="240" w:lineRule="auto"/>
+    </w:pPr>
+  </w:style>
+  <w:style w:type="character" w:customStyle="1" w:styleId="HeaderChar">
+    <w:name w:val="Header Char"/>
+    <w:basedOn w:val="DefaultParagraphFont"/>
+    <w:link w:val="Header"/>
+    <w:uiPriority w:val="99"/>
+    <w:rsid w:val="00EE13AF"/>
+  </w:style>
+  <w:style w:type="paragraph" w:styleId="Footer">
+    <w:name w:val="footer"/>
+    <w:basedOn w:val="Normal"/>
+    <w:link w:val="FooterChar"/>
+    <w:uiPriority w:val="99"/>
+    <w:unhideWhenUsed/>
+    <w:rsid w:val="00EE13AF"/>
+    <w:pPr>
+      <w:tabs>
+        <w:tab w:val="center" w:pos="4680"/>
+        <w:tab w:val="right" w:pos="9360"/>
+      </w:tabs>
+      <w:spacing w:after="0" w:line="240" w:lineRule="auto"/>
+    </w:pPr>
+  </w:style>
+  <w:style w:type="character" w:customStyle="1" w:styleId="FooterChar">
+    <w:name w:val="Footer Char"/>
+    <w:basedOn w:val="DefaultParagraphFont"/>
+    <w:link w:val="Footer"/>
+    <w:uiPriority w:val="99"/>
+    <w:rsid w:val="00EE13AF"/>
+  </w:style>
 </w:styles>
 </file>
 

</xml_diff>

<commit_message>
Added and updated docs June 12th
</commit_message>
<xml_diff>
--- a/d6_dart_new_features.docx
+++ b/d6_dart_new_features.docx
@@ -217,6 +217,20 @@
         </w:rPr>
         <w:t>9</w:t>
       </w:r>
+    </w:p>
+    <w:p>
+      <w:pPr>
+        <w:pStyle w:val="ListParagraph"/>
+        <w:numPr>
+          <w:ilvl w:val="0"/>
+          <w:numId w:val="5"/>
+        </w:numPr>
+        <w:jc w:val="both"/>
+        <w:rPr>
+          <w:sz w:val="36"/>
+          <w:szCs w:val="36"/>
+        </w:rPr>
+      </w:pPr>
     </w:p>
     <w:p>
       <w:pPr>
@@ -6631,21 +6645,7 @@
           <w:szCs w:val="36"/>
         </w:rPr>
         <w:lastRenderedPageBreak/>
-        <w:t>Less boilerplate</w:t>
-      </w:r>
-      <w:r>
-        <w:rPr>
-          <w:sz w:val="36"/>
-          <w:szCs w:val="36"/>
-        </w:rPr>
-        <w:t xml:space="preserve"> e</w:t>
-      </w:r>
-      <w:r>
-        <w:rPr>
-          <w:sz w:val="36"/>
-          <w:szCs w:val="36"/>
-        </w:rPr>
-        <w:t xml:space="preserve">specially for </w:t>
+        <w:t xml:space="preserve">Less boilerplate especially for </w:t>
       </w:r>
       <w:r>
         <w:rPr>
@@ -6682,35 +6682,7 @@
           <w:sz w:val="36"/>
           <w:szCs w:val="36"/>
         </w:rPr>
-        <w:t>Better readability (sometimes)</w:t>
-      </w:r>
-      <w:r>
-        <w:rPr>
-          <w:sz w:val="36"/>
-          <w:szCs w:val="36"/>
-        </w:rPr>
-        <w:t xml:space="preserve"> because p</w:t>
-      </w:r>
-      <w:r>
-        <w:rPr>
-          <w:sz w:val="36"/>
-          <w:szCs w:val="36"/>
-        </w:rPr>
-        <w:t xml:space="preserve">arameters </w:t>
-      </w:r>
-      <w:r>
-        <w:rPr>
-          <w:sz w:val="36"/>
-          <w:szCs w:val="36"/>
-        </w:rPr>
-        <w:t xml:space="preserve">are </w:t>
-      </w:r>
-      <w:r>
-        <w:rPr>
-          <w:sz w:val="36"/>
-          <w:szCs w:val="36"/>
-        </w:rPr>
-        <w:t>visible immediately.</w:t>
+        <w:t>Better readability (sometimes) because parameters are visible immediately.</w:t>
       </w:r>
     </w:p>
     <w:p>
@@ -6745,14 +6717,7 @@
           <w:sz w:val="36"/>
           <w:szCs w:val="36"/>
         </w:rPr>
-        <w:t xml:space="preserve"> c</w:t>
-      </w:r>
-      <w:r>
-        <w:rPr>
-          <w:sz w:val="36"/>
-          <w:szCs w:val="36"/>
-        </w:rPr>
-        <w:t xml:space="preserve">loser to </w:t>
+        <w:t xml:space="preserve"> closer to </w:t>
       </w:r>
       <w:r>
         <w:rPr>
@@ -6839,35 +6804,7 @@
           <w:sz w:val="36"/>
           <w:szCs w:val="36"/>
         </w:rPr>
-        <w:t xml:space="preserve"> dev</w:t>
-      </w:r>
-      <w:r>
-        <w:rPr>
-          <w:sz w:val="36"/>
-          <w:szCs w:val="36"/>
-        </w:rPr>
-        <w:t>’</w:t>
-      </w:r>
-      <w:r>
-        <w:rPr>
-          <w:sz w:val="36"/>
-          <w:szCs w:val="36"/>
-        </w:rPr>
-        <w:t>s don’t know it yet</w:t>
-      </w:r>
-      <w:r>
-        <w:rPr>
-          <w:sz w:val="36"/>
-          <w:szCs w:val="36"/>
-        </w:rPr>
-        <w:t xml:space="preserve">. </w:t>
-      </w:r>
-      <w:r>
-        <w:rPr>
-          <w:sz w:val="36"/>
-          <w:szCs w:val="36"/>
-        </w:rPr>
-        <w:t>Team readability matters more than “cool syntax”.</w:t>
+        <w:t xml:space="preserve"> dev’s don’t know it yet. Team readability matters more than “cool syntax”.</w:t>
       </w:r>
     </w:p>
     <w:p>
@@ -6944,14 +6881,7 @@
           <w:sz w:val="36"/>
           <w:szCs w:val="36"/>
         </w:rPr>
-        <w:t>codebases are</w:t>
-      </w:r>
-      <w:r>
-        <w:rPr>
-          <w:sz w:val="36"/>
-          <w:szCs w:val="36"/>
-        </w:rPr>
-        <w:t xml:space="preserve"> still adapting</w:t>
+        <w:t>codebases are still adapting</w:t>
       </w:r>
     </w:p>
     <w:p>
@@ -6972,21 +6902,7 @@
           <w:sz w:val="36"/>
           <w:szCs w:val="36"/>
         </w:rPr>
-        <w:t>Can become visually dense</w:t>
-      </w:r>
-      <w:r>
-        <w:rPr>
-          <w:sz w:val="36"/>
-          <w:szCs w:val="36"/>
-        </w:rPr>
-        <w:t xml:space="preserve"> or ugly f</w:t>
-      </w:r>
-      <w:r>
-        <w:rPr>
-          <w:sz w:val="36"/>
-          <w:szCs w:val="36"/>
-        </w:rPr>
-        <w:t>or large widgets:</w:t>
+        <w:t>Can become visually dense or ugly for large widgets:</w:t>
       </w:r>
     </w:p>
     <w:p>
@@ -7327,6 +7243,40 @@
           <w:szCs w:val="36"/>
         </w:rPr>
       </w:pPr>
+    </w:p>
+    <w:p>
+      <w:pPr>
+        <w:rPr>
+          <w:b/>
+          <w:bCs/>
+          <w:sz w:val="36"/>
+          <w:szCs w:val="36"/>
+        </w:rPr>
+      </w:pPr>
+      <w:r>
+        <w:rPr>
+          <w:b/>
+          <w:bCs/>
+          <w:sz w:val="36"/>
+          <w:szCs w:val="36"/>
+        </w:rPr>
+        <w:t>Dart Extension Types:</w:t>
+      </w:r>
+    </w:p>
+    <w:p>
+      <w:pPr>
+        <w:rPr>
+          <w:sz w:val="36"/>
+          <w:szCs w:val="36"/>
+        </w:rPr>
+      </w:pPr>
+      <w:r>
+        <w:rPr>
+          <w:sz w:val="36"/>
+          <w:szCs w:val="36"/>
+        </w:rPr>
+        <w:t># In Dart 3.12+</w:t>
+      </w:r>
     </w:p>
     <w:p>
       <w:pPr>
@@ -9133,6 +9083,7 @@
   <w:style w:type="character" w:default="1" w:styleId="DefaultParagraphFont">
     <w:name w:val="Default Paragraph Font"/>
     <w:uiPriority w:val="1"/>
+    <w:semiHidden/>
     <w:unhideWhenUsed/>
   </w:style>
   <w:style w:type="table" w:default="1" w:styleId="TableNormal">

</xml_diff>